<commit_message>
Stand nach 2 Tagen und einem fast fertigen Milestone
</commit_message>
<xml_diff>
--- a/Dokumente/Dokumentation_F1-app_durani.docx
+++ b/Dokumente/Dokumentation_F1-app_durani.docx
@@ -19,7 +19,7 @@
             <mc:AlternateContent>
               <mc:Choice Requires="wpg">
                 <w:drawing>
-                  <wp:anchor distT="0" distB="0" distL="114300" distR="114300" simplePos="0" relativeHeight="251659264" behindDoc="0" locked="0" layoutInCell="1" allowOverlap="1" wp14:anchorId="10410362" wp14:editId="0015CDF2">
+                  <wp:anchor distT="0" distB="0" distL="114300" distR="114300" simplePos="0" relativeHeight="251659264" behindDoc="0" locked="0" layoutInCell="1" allowOverlap="1" wp14:anchorId="10410362" wp14:editId="38C27A6B">
                     <wp:simplePos x="0" y="0"/>
                     <wp:positionH relativeFrom="page">
                       <wp:align>right</wp:align>
@@ -133,15 +133,6 @@
                               </a:prstGeom>
                               <a:grpFill/>
                               <a:extLst>
-                                <a:ext uri="{909E8E84-426E-40DD-AFC4-6F175D3DCCD1}">
-                                  <a14:hiddenFill xmlns:a14="http://schemas.microsoft.com/office/drawing/2010/main">
-                                    <a:solidFill>
-                                      <a:srgbClr val="FFFFFF">
-                                        <a:alpha val="80000"/>
-                                      </a:srgbClr>
-                                    </a:solidFill>
-                                  </a14:hiddenFill>
-                                </a:ext>
                                 <a:ext uri="{91240B29-F687-4F45-9708-019B960494DF}">
                                   <a14:hiddenLine xmlns:a14="http://schemas.microsoft.com/office/drawing/2010/main" w="12700">
                                     <a:solidFill>
@@ -199,8 +190,7 @@
                       <v:shadow color="#d8d8d8" offset="3pt,3pt"/>
                     </v:rect>
                     <v:rect id="Rechteck 460" o:spid="_x0000_s1028" style="position:absolute;left:1246;width:29718;height:100584;visibility:visible;mso-wrap-style:square;v-text-anchor:top" o:gfxdata="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" filled="f" stroked="f" strokecolor="#d8d8d8"/>
-                    <v:rect id="Rechteck 9" o:spid="_x0000_s1029" style="position:absolute;top:67610;width:30895;height:28333;visibility:visible;mso-wrap-style:square;v-text-anchor:bottom" o:gfxdata="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" filled="f" stroked="f" strokecolor="white" strokeweight="1pt">
-                      <v:fill opacity="52428f"/>
+                    <v:rect id="Rechteck 9" o:spid="_x0000_s1029" style="position:absolute;top:67610;width:30895;height:28333;visibility:visible;mso-wrap-style:square;v-text-anchor:bottom" o:gfxdata="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" filled="f" stroked="f" strokecolor="white" strokeweight="1pt">
                       <v:shadow color="#d8d8d8" offset="3pt,3pt"/>
                       <v:textbox inset="28.8pt,14.4pt,14.4pt,14.4pt">
                         <w:txbxContent>
@@ -402,7 +392,88 @@
               <w:noProof/>
             </w:rPr>
             <w:drawing>
-              <wp:anchor distT="0" distB="0" distL="114300" distR="114300" simplePos="0" relativeHeight="251664384" behindDoc="0" locked="0" layoutInCell="1" allowOverlap="1" wp14:anchorId="695C0981" wp14:editId="219CD0F3">
+              <wp:anchor distT="0" distB="0" distL="114300" distR="114300" simplePos="0" relativeHeight="251668480" behindDoc="0" locked="0" layoutInCell="1" allowOverlap="1" wp14:anchorId="57C64415" wp14:editId="5F50DA06">
+                <wp:simplePos x="0" y="0"/>
+                <wp:positionH relativeFrom="margin">
+                  <wp:align>right</wp:align>
+                </wp:positionH>
+                <wp:positionV relativeFrom="paragraph">
+                  <wp:posOffset>3180080</wp:posOffset>
+                </wp:positionV>
+                <wp:extent cx="5759450" cy="2371090"/>
+                <wp:effectExtent l="0" t="0" r="0" b="0"/>
+                <wp:wrapSquare wrapText="bothSides"/>
+                <wp:docPr id="912409920" name="Grafik 2" descr="Fotografie eines roten Formel-1-Rennwagens mit schwarzem und weißen Akzenten, der von vorne leicht seitlich gezeigt wird. Fahrzeug trägt Nummer 16, hat breite Reifen mit gelber Beschriftung und FIA-Logo auf Frontflügel.&#10;&#10;Quelle: https://corp.formula1.com/f1-2026-regulations-terminology-update/ ">
+                  <a:extLst xmlns:a="http://schemas.openxmlformats.org/drawingml/2006/main">
+                    <a:ext uri="{C183D7F6-B498-43B3-948B-1728B52AA6E4}">
+                      <adec:decorative xmlns:adec="http://schemas.microsoft.com/office/drawing/2017/decorative" val="0"/>
+                    </a:ext>
+                  </a:extLst>
+                </wp:docPr>
+                <wp:cNvGraphicFramePr>
+                  <a:graphicFrameLocks xmlns:a="http://schemas.openxmlformats.org/drawingml/2006/main" noChangeAspect="1"/>
+                </wp:cNvGraphicFramePr>
+                <a:graphic xmlns:a="http://schemas.openxmlformats.org/drawingml/2006/main">
+                  <a:graphicData uri="http://schemas.openxmlformats.org/drawingml/2006/picture">
+                    <pic:pic xmlns:pic="http://schemas.openxmlformats.org/drawingml/2006/picture">
+                      <pic:nvPicPr>
+                        <pic:cNvPr id="912409920" name="Grafik 2" descr="Fotografie eines roten Formel-1-Rennwagens mit schwarzem und weißen Akzenten, der von vorne leicht seitlich gezeigt wird. Fahrzeug trägt Nummer 16, hat breite Reifen mit gelber Beschriftung und FIA-Logo auf Frontflügel.&#10;&#10;Quelle: https://corp.formula1.com/f1-2026-regulations-terminology-update/ ">
+                          <a:extLst>
+                            <a:ext uri="{C183D7F6-B498-43B3-948B-1728B52AA6E4}">
+                              <adec:decorative xmlns:adec="http://schemas.microsoft.com/office/drawing/2017/decorative" val="0"/>
+                            </a:ext>
+                          </a:extLst>
+                        </pic:cNvPr>
+                        <pic:cNvPicPr/>
+                      </pic:nvPicPr>
+                      <pic:blipFill rotWithShape="1">
+                        <a:blip r:embed="rId9">
+                          <a:extLst>
+                            <a:ext uri="{28A0092B-C50C-407E-A947-70E740481C1C}">
+                              <a14:useLocalDpi xmlns:a14="http://schemas.microsoft.com/office/drawing/2010/main" val="0"/>
+                            </a:ext>
+                          </a:extLst>
+                        </a:blip>
+                        <a:srcRect l="11583" t="22346" r="13230" b="22682"/>
+                        <a:stretch>
+                          <a:fillRect/>
+                        </a:stretch>
+                      </pic:blipFill>
+                      <pic:spPr bwMode="auto">
+                        <a:xfrm>
+                          <a:off x="0" y="0"/>
+                          <a:ext cx="5759450" cy="2371090"/>
+                        </a:xfrm>
+                        <a:prstGeom prst="rect">
+                          <a:avLst/>
+                        </a:prstGeom>
+                        <a:ln>
+                          <a:noFill/>
+                        </a:ln>
+                        <a:extLst>
+                          <a:ext uri="{53640926-AAD7-44D8-BBD7-CCE9431645EC}">
+                            <a14:shadowObscured xmlns:a14="http://schemas.microsoft.com/office/drawing/2010/main"/>
+                          </a:ext>
+                        </a:extLst>
+                      </pic:spPr>
+                    </pic:pic>
+                  </a:graphicData>
+                </a:graphic>
+                <wp14:sizeRelH relativeFrom="margin">
+                  <wp14:pctWidth>0</wp14:pctWidth>
+                </wp14:sizeRelH>
+                <wp14:sizeRelV relativeFrom="margin">
+                  <wp14:pctHeight>0</wp14:pctHeight>
+                </wp14:sizeRelV>
+              </wp:anchor>
+            </w:drawing>
+          </w:r>
+          <w:r>
+            <w:rPr>
+              <w:noProof/>
+            </w:rPr>
+            <w:drawing>
+              <wp:anchor distT="0" distB="0" distL="114300" distR="114300" simplePos="0" relativeHeight="251664384" behindDoc="0" locked="0" layoutInCell="1" allowOverlap="1" wp14:anchorId="695C0981" wp14:editId="3FA5B005">
                 <wp:simplePos x="0" y="0"/>
                 <wp:positionH relativeFrom="page">
                   <wp:posOffset>47951</wp:posOffset>
@@ -425,11 +496,11 @@
                         <pic:cNvPicPr/>
                       </pic:nvPicPr>
                       <pic:blipFill rotWithShape="1">
-                        <a:blip r:embed="rId8" cstate="print">
+                        <a:blip r:embed="rId10" cstate="print">
                           <a:extLst>
                             <a:ext uri="{BEBA8EAE-BF5A-486C-A8C5-ECC9F3942E4B}">
                               <a14:imgProps xmlns:a14="http://schemas.microsoft.com/office/drawing/2010/main">
-                                <a14:imgLayer r:embed="rId9">
+                                <a14:imgLayer r:embed="rId11">
                                   <a14:imgEffect>
                                     <a14:backgroundRemoval t="10000" b="90000" l="10000" r="90000">
                                       <a14:foregroundMark x1="26027" y1="45205" x2="32877" y2="39726"/>
@@ -502,87 +573,6 @@
             </w:drawing>
           </w:r>
           <w:r>
-            <w:rPr>
-              <w:noProof/>
-            </w:rPr>
-            <w:drawing>
-              <wp:anchor distT="0" distB="0" distL="114300" distR="114300" simplePos="0" relativeHeight="251668480" behindDoc="0" locked="0" layoutInCell="1" allowOverlap="1" wp14:anchorId="57C64415" wp14:editId="1F8C7A74">
-                <wp:simplePos x="0" y="0"/>
-                <wp:positionH relativeFrom="margin">
-                  <wp:posOffset>66675</wp:posOffset>
-                </wp:positionH>
-                <wp:positionV relativeFrom="paragraph">
-                  <wp:posOffset>2932430</wp:posOffset>
-                </wp:positionV>
-                <wp:extent cx="5759450" cy="2371090"/>
-                <wp:effectExtent l="0" t="0" r="0" b="0"/>
-                <wp:wrapSquare wrapText="bothSides"/>
-                <wp:docPr id="912409920" name="Grafik 2" descr="Fotografie eines roten Formel-1-Rennwagens mit schwarzem und weißen Akzenten, der von vorne leicht seitlich gezeigt wird. Fahrzeug trägt Nummer 16, hat breite Reifen mit gelber Beschriftung und FIA-Logo auf Frontflügel.&#10;&#10;Quelle: https://corp.formula1.com/f1-2026-regulations-terminology-update/ ">
-                  <a:extLst xmlns:a="http://schemas.openxmlformats.org/drawingml/2006/main">
-                    <a:ext uri="{C183D7F6-B498-43B3-948B-1728B52AA6E4}">
-                      <adec:decorative xmlns:adec="http://schemas.microsoft.com/office/drawing/2017/decorative" val="0"/>
-                    </a:ext>
-                  </a:extLst>
-                </wp:docPr>
-                <wp:cNvGraphicFramePr>
-                  <a:graphicFrameLocks xmlns:a="http://schemas.openxmlformats.org/drawingml/2006/main" noChangeAspect="1"/>
-                </wp:cNvGraphicFramePr>
-                <a:graphic xmlns:a="http://schemas.openxmlformats.org/drawingml/2006/main">
-                  <a:graphicData uri="http://schemas.openxmlformats.org/drawingml/2006/picture">
-                    <pic:pic xmlns:pic="http://schemas.openxmlformats.org/drawingml/2006/picture">
-                      <pic:nvPicPr>
-                        <pic:cNvPr id="912409920" name="Grafik 2" descr="Fotografie eines roten Formel-1-Rennwagens mit schwarzem und weißen Akzenten, der von vorne leicht seitlich gezeigt wird. Fahrzeug trägt Nummer 16, hat breite Reifen mit gelber Beschriftung und FIA-Logo auf Frontflügel.&#10;&#10;Quelle: https://corp.formula1.com/f1-2026-regulations-terminology-update/ ">
-                          <a:extLst>
-                            <a:ext uri="{C183D7F6-B498-43B3-948B-1728B52AA6E4}">
-                              <adec:decorative xmlns:adec="http://schemas.microsoft.com/office/drawing/2017/decorative" val="0"/>
-                            </a:ext>
-                          </a:extLst>
-                        </pic:cNvPr>
-                        <pic:cNvPicPr/>
-                      </pic:nvPicPr>
-                      <pic:blipFill rotWithShape="1">
-                        <a:blip r:embed="rId10">
-                          <a:extLst>
-                            <a:ext uri="{28A0092B-C50C-407E-A947-70E740481C1C}">
-                              <a14:useLocalDpi xmlns:a14="http://schemas.microsoft.com/office/drawing/2010/main" val="0"/>
-                            </a:ext>
-                          </a:extLst>
-                        </a:blip>
-                        <a:srcRect l="11583" t="22346" r="13230" b="22682"/>
-                        <a:stretch>
-                          <a:fillRect/>
-                        </a:stretch>
-                      </pic:blipFill>
-                      <pic:spPr bwMode="auto">
-                        <a:xfrm>
-                          <a:off x="0" y="0"/>
-                          <a:ext cx="5759450" cy="2371090"/>
-                        </a:xfrm>
-                        <a:prstGeom prst="rect">
-                          <a:avLst/>
-                        </a:prstGeom>
-                        <a:ln>
-                          <a:noFill/>
-                        </a:ln>
-                        <a:extLst>
-                          <a:ext uri="{53640926-AAD7-44D8-BBD7-CCE9431645EC}">
-                            <a14:shadowObscured xmlns:a14="http://schemas.microsoft.com/office/drawing/2010/main"/>
-                          </a:ext>
-                        </a:extLst>
-                      </pic:spPr>
-                    </pic:pic>
-                  </a:graphicData>
-                </a:graphic>
-                <wp14:sizeRelH relativeFrom="margin">
-                  <wp14:pctWidth>0</wp14:pctWidth>
-                </wp14:sizeRelH>
-                <wp14:sizeRelV relativeFrom="margin">
-                  <wp14:pctHeight>0</wp14:pctHeight>
-                </wp14:sizeRelV>
-              </wp:anchor>
-            </w:drawing>
-          </w:r>
-          <w:r>
             <w:br w:type="page"/>
           </w:r>
         </w:p>
@@ -592,7 +582,13 @@
     <w:sdt>
       <w:sdtPr>
         <w:rPr>
-          <w:lang w:val="de-DE"/>
+          <w:rFonts w:asciiTheme="minorHAnsi" w:eastAsiaTheme="minorHAnsi" w:hAnsiTheme="minorHAnsi" w:cstheme="minorBidi"/>
+          <w:color w:val="auto"/>
+          <w:kern w:val="2"/>
+          <w:sz w:val="24"/>
+          <w:szCs w:val="24"/>
+          <w:lang w:val="de-DE" w:eastAsia="en-US"/>
+          <w14:ligatures w14:val="standardContextual"/>
         </w:rPr>
         <w:id w:val="2080700233"/>
         <w:docPartObj>
@@ -602,15 +598,8 @@
       </w:sdtPr>
       <w:sdtEndPr>
         <w:rPr>
-          <w:rFonts w:asciiTheme="minorHAnsi" w:eastAsiaTheme="minorHAnsi" w:hAnsiTheme="minorHAnsi" w:cstheme="minorBidi"/>
           <w:b/>
           <w:bCs/>
-          <w:color w:val="auto"/>
-          <w:kern w:val="2"/>
-          <w:sz w:val="24"/>
-          <w:szCs w:val="24"/>
-          <w:lang w:eastAsia="en-US"/>
-          <w14:ligatures w14:val="standardContextual"/>
         </w:rPr>
       </w:sdtEndPr>
       <w:sdtContent>
@@ -633,6 +622,7 @@
           <w:pPr>
             <w:pStyle w:val="Verzeichnis1"/>
             <w:tabs>
+              <w:tab w:val="left" w:pos="720"/>
               <w:tab w:val="right" w:leader="dot" w:pos="9062"/>
             </w:tabs>
             <w:rPr>
@@ -650,23 +640,38 @@
           <w:r>
             <w:fldChar w:fldCharType="separate"/>
           </w:r>
-          <w:hyperlink w:anchor="_Toc231820046" w:history="1">
+          <w:hyperlink w:anchor="_Toc231907574" w:history="1">
             <w:r>
               <w:rPr>
                 <w:rStyle w:val="Hyperlink"/>
                 <w:noProof/>
               </w:rPr>
-              <w:t>Kapitel 1</w:t>
-            </w:r>
-            <w:r>
-              <w:rPr>
-                <w:noProof/>
-                <w:webHidden/>
+              <w:t>1.1</w:t>
+            </w:r>
+            <w:r>
+              <w:rPr>
+                <w:rFonts w:eastAsiaTheme="minorEastAsia"/>
+                <w:noProof/>
+                <w:lang w:eastAsia="de-CH"/>
               </w:rPr>
               <w:tab/>
             </w:r>
             <w:r>
               <w:rPr>
+                <w:rStyle w:val="Hyperlink"/>
+                <w:noProof/>
+              </w:rPr>
+              <w:t>Projektbeschreibung</w:t>
+            </w:r>
+            <w:r>
+              <w:rPr>
+                <w:noProof/>
+                <w:webHidden/>
+              </w:rPr>
+              <w:tab/>
+            </w:r>
+            <w:r>
+              <w:rPr>
                 <w:noProof/>
                 <w:webHidden/>
               </w:rPr>
@@ -677,7 +682,7 @@
                 <w:noProof/>
                 <w:webHidden/>
               </w:rPr>
-              <w:instrText xml:space="preserve"> PAGEREF _Toc231820046 \h </w:instrText>
+              <w:instrText xml:space="preserve"> PAGEREF _Toc231907574 \h </w:instrText>
             </w:r>
             <w:r>
               <w:rPr>
@@ -697,7 +702,7 @@
                 <w:noProof/>
                 <w:webHidden/>
               </w:rPr>
-              <w:t>2</w:t>
+              <w:t>3</w:t>
             </w:r>
             <w:r>
               <w:rPr>
@@ -720,13 +725,13 @@
               <w:lang w:eastAsia="de-CH"/>
             </w:rPr>
           </w:pPr>
-          <w:hyperlink w:anchor="_Toc231820047" w:history="1">
+          <w:hyperlink w:anchor="_Toc231907575" w:history="1">
             <w:r>
               <w:rPr>
                 <w:rStyle w:val="Hyperlink"/>
                 <w:noProof/>
               </w:rPr>
-              <w:t>Kapitel 2</w:t>
+              <w:t>1.2 Ziel des Projekts</w:t>
             </w:r>
             <w:r>
               <w:rPr>
@@ -747,7 +752,7 @@
                 <w:noProof/>
                 <w:webHidden/>
               </w:rPr>
-              <w:instrText xml:space="preserve"> PAGEREF _Toc231820047 \h </w:instrText>
+              <w:instrText xml:space="preserve"> PAGEREF _Toc231907575 \h </w:instrText>
             </w:r>
             <w:r>
               <w:rPr>
@@ -767,7 +772,77 @@
                 <w:noProof/>
                 <w:webHidden/>
               </w:rPr>
-              <w:t>2</w:t>
+              <w:t>3</w:t>
+            </w:r>
+            <w:r>
+              <w:rPr>
+                <w:noProof/>
+                <w:webHidden/>
+              </w:rPr>
+              <w:fldChar w:fldCharType="end"/>
+            </w:r>
+          </w:hyperlink>
+        </w:p>
+        <w:p>
+          <w:pPr>
+            <w:pStyle w:val="Verzeichnis2"/>
+            <w:tabs>
+              <w:tab w:val="right" w:leader="dot" w:pos="9062"/>
+            </w:tabs>
+            <w:rPr>
+              <w:rFonts w:eastAsiaTheme="minorEastAsia"/>
+              <w:noProof/>
+              <w:lang w:eastAsia="de-CH"/>
+            </w:rPr>
+          </w:pPr>
+          <w:hyperlink w:anchor="_Toc231907576" w:history="1">
+            <w:r>
+              <w:rPr>
+                <w:rStyle w:val="Hyperlink"/>
+                <w:noProof/>
+              </w:rPr>
+              <w:t>1.3 Verwendete Technologien</w:t>
+            </w:r>
+            <w:r>
+              <w:rPr>
+                <w:noProof/>
+                <w:webHidden/>
+              </w:rPr>
+              <w:tab/>
+            </w:r>
+            <w:r>
+              <w:rPr>
+                <w:noProof/>
+                <w:webHidden/>
+              </w:rPr>
+              <w:fldChar w:fldCharType="begin"/>
+            </w:r>
+            <w:r>
+              <w:rPr>
+                <w:noProof/>
+                <w:webHidden/>
+              </w:rPr>
+              <w:instrText xml:space="preserve"> PAGEREF _Toc231907576 \h </w:instrText>
+            </w:r>
+            <w:r>
+              <w:rPr>
+                <w:noProof/>
+                <w:webHidden/>
+              </w:rPr>
+            </w:r>
+            <w:r>
+              <w:rPr>
+                <w:noProof/>
+                <w:webHidden/>
+              </w:rPr>
+              <w:fldChar w:fldCharType="separate"/>
+            </w:r>
+            <w:r>
+              <w:rPr>
+                <w:noProof/>
+                <w:webHidden/>
+              </w:rPr>
+              <w:t>3</w:t>
             </w:r>
             <w:r>
               <w:rPr>
@@ -790,13 +865,13 @@
               <w:lang w:eastAsia="de-CH"/>
             </w:rPr>
           </w:pPr>
-          <w:hyperlink w:anchor="_Toc231820048" w:history="1">
+          <w:hyperlink w:anchor="_Toc231907577" w:history="1">
             <w:r>
               <w:rPr>
                 <w:rStyle w:val="Hyperlink"/>
                 <w:noProof/>
               </w:rPr>
-              <w:t>Kapitel 3</w:t>
+              <w:t>1.3.1 Frontend</w:t>
             </w:r>
             <w:r>
               <w:rPr>
@@ -817,7 +892,7 @@
                 <w:noProof/>
                 <w:webHidden/>
               </w:rPr>
-              <w:instrText xml:space="preserve"> PAGEREF _Toc231820048 \h </w:instrText>
+              <w:instrText xml:space="preserve"> PAGEREF _Toc231907577 \h </w:instrText>
             </w:r>
             <w:r>
               <w:rPr>
@@ -837,7 +912,1268 @@
                 <w:noProof/>
                 <w:webHidden/>
               </w:rPr>
-              <w:t>2</w:t>
+              <w:t>3</w:t>
+            </w:r>
+            <w:r>
+              <w:rPr>
+                <w:noProof/>
+                <w:webHidden/>
+              </w:rPr>
+              <w:fldChar w:fldCharType="end"/>
+            </w:r>
+          </w:hyperlink>
+        </w:p>
+        <w:p>
+          <w:pPr>
+            <w:pStyle w:val="Verzeichnis3"/>
+            <w:tabs>
+              <w:tab w:val="right" w:leader="dot" w:pos="9062"/>
+            </w:tabs>
+            <w:rPr>
+              <w:rFonts w:eastAsiaTheme="minorEastAsia"/>
+              <w:noProof/>
+              <w:lang w:eastAsia="de-CH"/>
+            </w:rPr>
+          </w:pPr>
+          <w:hyperlink w:anchor="_Toc231907578" w:history="1">
+            <w:r>
+              <w:rPr>
+                <w:rStyle w:val="Hyperlink"/>
+                <w:noProof/>
+                <w:lang w:val="en-US"/>
+              </w:rPr>
+              <w:t>1.3.2Backend (Backend-as-a-Service)</w:t>
+            </w:r>
+            <w:r>
+              <w:rPr>
+                <w:noProof/>
+                <w:webHidden/>
+              </w:rPr>
+              <w:tab/>
+            </w:r>
+            <w:r>
+              <w:rPr>
+                <w:noProof/>
+                <w:webHidden/>
+              </w:rPr>
+              <w:fldChar w:fldCharType="begin"/>
+            </w:r>
+            <w:r>
+              <w:rPr>
+                <w:noProof/>
+                <w:webHidden/>
+              </w:rPr>
+              <w:instrText xml:space="preserve"> PAGEREF _Toc231907578 \h </w:instrText>
+            </w:r>
+            <w:r>
+              <w:rPr>
+                <w:noProof/>
+                <w:webHidden/>
+              </w:rPr>
+            </w:r>
+            <w:r>
+              <w:rPr>
+                <w:noProof/>
+                <w:webHidden/>
+              </w:rPr>
+              <w:fldChar w:fldCharType="separate"/>
+            </w:r>
+            <w:r>
+              <w:rPr>
+                <w:noProof/>
+                <w:webHidden/>
+              </w:rPr>
+              <w:t>3</w:t>
+            </w:r>
+            <w:r>
+              <w:rPr>
+                <w:noProof/>
+                <w:webHidden/>
+              </w:rPr>
+              <w:fldChar w:fldCharType="end"/>
+            </w:r>
+          </w:hyperlink>
+        </w:p>
+        <w:p>
+          <w:pPr>
+            <w:pStyle w:val="Verzeichnis3"/>
+            <w:tabs>
+              <w:tab w:val="right" w:leader="dot" w:pos="9062"/>
+            </w:tabs>
+            <w:rPr>
+              <w:rFonts w:eastAsiaTheme="minorEastAsia"/>
+              <w:noProof/>
+              <w:lang w:eastAsia="de-CH"/>
+            </w:rPr>
+          </w:pPr>
+          <w:hyperlink w:anchor="_Toc231907579" w:history="1">
+            <w:r>
+              <w:rPr>
+                <w:rStyle w:val="Hyperlink"/>
+                <w:noProof/>
+              </w:rPr>
+              <w:t>1.3.3 Datenquelle</w:t>
+            </w:r>
+            <w:r>
+              <w:rPr>
+                <w:noProof/>
+                <w:webHidden/>
+              </w:rPr>
+              <w:tab/>
+            </w:r>
+            <w:r>
+              <w:rPr>
+                <w:noProof/>
+                <w:webHidden/>
+              </w:rPr>
+              <w:fldChar w:fldCharType="begin"/>
+            </w:r>
+            <w:r>
+              <w:rPr>
+                <w:noProof/>
+                <w:webHidden/>
+              </w:rPr>
+              <w:instrText xml:space="preserve"> PAGEREF _Toc231907579 \h </w:instrText>
+            </w:r>
+            <w:r>
+              <w:rPr>
+                <w:noProof/>
+                <w:webHidden/>
+              </w:rPr>
+            </w:r>
+            <w:r>
+              <w:rPr>
+                <w:noProof/>
+                <w:webHidden/>
+              </w:rPr>
+              <w:fldChar w:fldCharType="separate"/>
+            </w:r>
+            <w:r>
+              <w:rPr>
+                <w:noProof/>
+                <w:webHidden/>
+              </w:rPr>
+              <w:t>4</w:t>
+            </w:r>
+            <w:r>
+              <w:rPr>
+                <w:noProof/>
+                <w:webHidden/>
+              </w:rPr>
+              <w:fldChar w:fldCharType="end"/>
+            </w:r>
+          </w:hyperlink>
+        </w:p>
+        <w:p>
+          <w:pPr>
+            <w:pStyle w:val="Verzeichnis3"/>
+            <w:tabs>
+              <w:tab w:val="right" w:leader="dot" w:pos="9062"/>
+            </w:tabs>
+            <w:rPr>
+              <w:rFonts w:eastAsiaTheme="minorEastAsia"/>
+              <w:noProof/>
+              <w:lang w:eastAsia="de-CH"/>
+            </w:rPr>
+          </w:pPr>
+          <w:hyperlink w:anchor="_Toc231907580" w:history="1">
+            <w:r>
+              <w:rPr>
+                <w:rStyle w:val="Hyperlink"/>
+                <w:noProof/>
+              </w:rPr>
+              <w:t>1.3.4 Authentifizierung</w:t>
+            </w:r>
+            <w:r>
+              <w:rPr>
+                <w:noProof/>
+                <w:webHidden/>
+              </w:rPr>
+              <w:tab/>
+            </w:r>
+            <w:r>
+              <w:rPr>
+                <w:noProof/>
+                <w:webHidden/>
+              </w:rPr>
+              <w:fldChar w:fldCharType="begin"/>
+            </w:r>
+            <w:r>
+              <w:rPr>
+                <w:noProof/>
+                <w:webHidden/>
+              </w:rPr>
+              <w:instrText xml:space="preserve"> PAGEREF _Toc231907580 \h </w:instrText>
+            </w:r>
+            <w:r>
+              <w:rPr>
+                <w:noProof/>
+                <w:webHidden/>
+              </w:rPr>
+            </w:r>
+            <w:r>
+              <w:rPr>
+                <w:noProof/>
+                <w:webHidden/>
+              </w:rPr>
+              <w:fldChar w:fldCharType="separate"/>
+            </w:r>
+            <w:r>
+              <w:rPr>
+                <w:noProof/>
+                <w:webHidden/>
+              </w:rPr>
+              <w:t>4</w:t>
+            </w:r>
+            <w:r>
+              <w:rPr>
+                <w:noProof/>
+                <w:webHidden/>
+              </w:rPr>
+              <w:fldChar w:fldCharType="end"/>
+            </w:r>
+          </w:hyperlink>
+        </w:p>
+        <w:p>
+          <w:pPr>
+            <w:pStyle w:val="Verzeichnis3"/>
+            <w:tabs>
+              <w:tab w:val="right" w:leader="dot" w:pos="9062"/>
+            </w:tabs>
+            <w:rPr>
+              <w:rFonts w:eastAsiaTheme="minorEastAsia"/>
+              <w:noProof/>
+              <w:lang w:eastAsia="de-CH"/>
+            </w:rPr>
+          </w:pPr>
+          <w:hyperlink w:anchor="_Toc231907581" w:history="1">
+            <w:r>
+              <w:rPr>
+                <w:rStyle w:val="Hyperlink"/>
+                <w:noProof/>
+              </w:rPr>
+              <w:t>1.3.5Deployment</w:t>
+            </w:r>
+            <w:r>
+              <w:rPr>
+                <w:noProof/>
+                <w:webHidden/>
+              </w:rPr>
+              <w:tab/>
+            </w:r>
+            <w:r>
+              <w:rPr>
+                <w:noProof/>
+                <w:webHidden/>
+              </w:rPr>
+              <w:fldChar w:fldCharType="begin"/>
+            </w:r>
+            <w:r>
+              <w:rPr>
+                <w:noProof/>
+                <w:webHidden/>
+              </w:rPr>
+              <w:instrText xml:space="preserve"> PAGEREF _Toc231907581 \h </w:instrText>
+            </w:r>
+            <w:r>
+              <w:rPr>
+                <w:noProof/>
+                <w:webHidden/>
+              </w:rPr>
+            </w:r>
+            <w:r>
+              <w:rPr>
+                <w:noProof/>
+                <w:webHidden/>
+              </w:rPr>
+              <w:fldChar w:fldCharType="separate"/>
+            </w:r>
+            <w:r>
+              <w:rPr>
+                <w:noProof/>
+                <w:webHidden/>
+              </w:rPr>
+              <w:t>4</w:t>
+            </w:r>
+            <w:r>
+              <w:rPr>
+                <w:noProof/>
+                <w:webHidden/>
+              </w:rPr>
+              <w:fldChar w:fldCharType="end"/>
+            </w:r>
+          </w:hyperlink>
+        </w:p>
+        <w:p>
+          <w:pPr>
+            <w:pStyle w:val="Verzeichnis2"/>
+            <w:tabs>
+              <w:tab w:val="right" w:leader="dot" w:pos="9062"/>
+            </w:tabs>
+            <w:rPr>
+              <w:rFonts w:eastAsiaTheme="minorEastAsia"/>
+              <w:noProof/>
+              <w:lang w:eastAsia="de-CH"/>
+            </w:rPr>
+          </w:pPr>
+          <w:hyperlink w:anchor="_Toc231907582" w:history="1">
+            <w:r>
+              <w:rPr>
+                <w:rStyle w:val="Hyperlink"/>
+                <w:noProof/>
+              </w:rPr>
+              <w:t>1.4 Architektur</w:t>
+            </w:r>
+            <w:r>
+              <w:rPr>
+                <w:noProof/>
+                <w:webHidden/>
+              </w:rPr>
+              <w:tab/>
+            </w:r>
+            <w:r>
+              <w:rPr>
+                <w:noProof/>
+                <w:webHidden/>
+              </w:rPr>
+              <w:fldChar w:fldCharType="begin"/>
+            </w:r>
+            <w:r>
+              <w:rPr>
+                <w:noProof/>
+                <w:webHidden/>
+              </w:rPr>
+              <w:instrText xml:space="preserve"> PAGEREF _Toc231907582 \h </w:instrText>
+            </w:r>
+            <w:r>
+              <w:rPr>
+                <w:noProof/>
+                <w:webHidden/>
+              </w:rPr>
+            </w:r>
+            <w:r>
+              <w:rPr>
+                <w:noProof/>
+                <w:webHidden/>
+              </w:rPr>
+              <w:fldChar w:fldCharType="separate"/>
+            </w:r>
+            <w:r>
+              <w:rPr>
+                <w:noProof/>
+                <w:webHidden/>
+              </w:rPr>
+              <w:t>4</w:t>
+            </w:r>
+            <w:r>
+              <w:rPr>
+                <w:noProof/>
+                <w:webHidden/>
+              </w:rPr>
+              <w:fldChar w:fldCharType="end"/>
+            </w:r>
+          </w:hyperlink>
+        </w:p>
+        <w:p>
+          <w:pPr>
+            <w:pStyle w:val="Verzeichnis2"/>
+            <w:tabs>
+              <w:tab w:val="right" w:leader="dot" w:pos="9062"/>
+            </w:tabs>
+            <w:rPr>
+              <w:rFonts w:eastAsiaTheme="minorEastAsia"/>
+              <w:noProof/>
+              <w:lang w:eastAsia="de-CH"/>
+            </w:rPr>
+          </w:pPr>
+          <w:hyperlink w:anchor="_Toc231907583" w:history="1">
+            <w:r>
+              <w:rPr>
+                <w:rStyle w:val="Hyperlink"/>
+                <w:noProof/>
+              </w:rPr>
+              <w:t>1.5 Datenstruktur</w:t>
+            </w:r>
+            <w:r>
+              <w:rPr>
+                <w:noProof/>
+                <w:webHidden/>
+              </w:rPr>
+              <w:tab/>
+            </w:r>
+            <w:r>
+              <w:rPr>
+                <w:noProof/>
+                <w:webHidden/>
+              </w:rPr>
+              <w:fldChar w:fldCharType="begin"/>
+            </w:r>
+            <w:r>
+              <w:rPr>
+                <w:noProof/>
+                <w:webHidden/>
+              </w:rPr>
+              <w:instrText xml:space="preserve"> PAGEREF _Toc231907583 \h </w:instrText>
+            </w:r>
+            <w:r>
+              <w:rPr>
+                <w:noProof/>
+                <w:webHidden/>
+              </w:rPr>
+            </w:r>
+            <w:r>
+              <w:rPr>
+                <w:noProof/>
+                <w:webHidden/>
+              </w:rPr>
+              <w:fldChar w:fldCharType="separate"/>
+            </w:r>
+            <w:r>
+              <w:rPr>
+                <w:noProof/>
+                <w:webHidden/>
+              </w:rPr>
+              <w:t>4</w:t>
+            </w:r>
+            <w:r>
+              <w:rPr>
+                <w:noProof/>
+                <w:webHidden/>
+              </w:rPr>
+              <w:fldChar w:fldCharType="end"/>
+            </w:r>
+          </w:hyperlink>
+        </w:p>
+        <w:p>
+          <w:pPr>
+            <w:pStyle w:val="Verzeichnis2"/>
+            <w:tabs>
+              <w:tab w:val="right" w:leader="dot" w:pos="9062"/>
+            </w:tabs>
+            <w:rPr>
+              <w:rFonts w:eastAsiaTheme="minorEastAsia"/>
+              <w:noProof/>
+              <w:lang w:eastAsia="de-CH"/>
+            </w:rPr>
+          </w:pPr>
+          <w:hyperlink w:anchor="_Toc231907584" w:history="1">
+            <w:r>
+              <w:rPr>
+                <w:rStyle w:val="Hyperlink"/>
+                <w:noProof/>
+              </w:rPr>
+              <w:t>1.6 Besonderheiten des Projekts</w:t>
+            </w:r>
+            <w:r>
+              <w:rPr>
+                <w:noProof/>
+                <w:webHidden/>
+              </w:rPr>
+              <w:tab/>
+            </w:r>
+            <w:r>
+              <w:rPr>
+                <w:noProof/>
+                <w:webHidden/>
+              </w:rPr>
+              <w:fldChar w:fldCharType="begin"/>
+            </w:r>
+            <w:r>
+              <w:rPr>
+                <w:noProof/>
+                <w:webHidden/>
+              </w:rPr>
+              <w:instrText xml:space="preserve"> PAGEREF _Toc231907584 \h </w:instrText>
+            </w:r>
+            <w:r>
+              <w:rPr>
+                <w:noProof/>
+                <w:webHidden/>
+              </w:rPr>
+            </w:r>
+            <w:r>
+              <w:rPr>
+                <w:noProof/>
+                <w:webHidden/>
+              </w:rPr>
+              <w:fldChar w:fldCharType="separate"/>
+            </w:r>
+            <w:r>
+              <w:rPr>
+                <w:noProof/>
+                <w:webHidden/>
+              </w:rPr>
+              <w:t>4</w:t>
+            </w:r>
+            <w:r>
+              <w:rPr>
+                <w:noProof/>
+                <w:webHidden/>
+              </w:rPr>
+              <w:fldChar w:fldCharType="end"/>
+            </w:r>
+          </w:hyperlink>
+        </w:p>
+        <w:p>
+          <w:pPr>
+            <w:pStyle w:val="Verzeichnis2"/>
+            <w:tabs>
+              <w:tab w:val="right" w:leader="dot" w:pos="9062"/>
+            </w:tabs>
+            <w:rPr>
+              <w:rFonts w:eastAsiaTheme="minorEastAsia"/>
+              <w:noProof/>
+              <w:lang w:eastAsia="de-CH"/>
+            </w:rPr>
+          </w:pPr>
+          <w:hyperlink w:anchor="_Toc231907585" w:history="1">
+            <w:r>
+              <w:rPr>
+                <w:rStyle w:val="Hyperlink"/>
+                <w:noProof/>
+              </w:rPr>
+              <w:t>1.7 Zusammenfassung</w:t>
+            </w:r>
+            <w:r>
+              <w:rPr>
+                <w:noProof/>
+                <w:webHidden/>
+              </w:rPr>
+              <w:tab/>
+            </w:r>
+            <w:r>
+              <w:rPr>
+                <w:noProof/>
+                <w:webHidden/>
+              </w:rPr>
+              <w:fldChar w:fldCharType="begin"/>
+            </w:r>
+            <w:r>
+              <w:rPr>
+                <w:noProof/>
+                <w:webHidden/>
+              </w:rPr>
+              <w:instrText xml:space="preserve"> PAGEREF _Toc231907585 \h </w:instrText>
+            </w:r>
+            <w:r>
+              <w:rPr>
+                <w:noProof/>
+                <w:webHidden/>
+              </w:rPr>
+            </w:r>
+            <w:r>
+              <w:rPr>
+                <w:noProof/>
+                <w:webHidden/>
+              </w:rPr>
+              <w:fldChar w:fldCharType="separate"/>
+            </w:r>
+            <w:r>
+              <w:rPr>
+                <w:noProof/>
+                <w:webHidden/>
+              </w:rPr>
+              <w:t>5</w:t>
+            </w:r>
+            <w:r>
+              <w:rPr>
+                <w:noProof/>
+                <w:webHidden/>
+              </w:rPr>
+              <w:fldChar w:fldCharType="end"/>
+            </w:r>
+          </w:hyperlink>
+        </w:p>
+        <w:p>
+          <w:pPr>
+            <w:pStyle w:val="Verzeichnis1"/>
+            <w:tabs>
+              <w:tab w:val="right" w:leader="dot" w:pos="9062"/>
+            </w:tabs>
+            <w:rPr>
+              <w:rFonts w:eastAsiaTheme="minorEastAsia"/>
+              <w:noProof/>
+              <w:lang w:eastAsia="de-CH"/>
+            </w:rPr>
+          </w:pPr>
+          <w:hyperlink w:anchor="_Toc231907586" w:history="1">
+            <w:r>
+              <w:rPr>
+                <w:rStyle w:val="Hyperlink"/>
+                <w:noProof/>
+              </w:rPr>
+              <w:t>2.1 Mögliche Risiken</w:t>
+            </w:r>
+            <w:r>
+              <w:rPr>
+                <w:noProof/>
+                <w:webHidden/>
+              </w:rPr>
+              <w:tab/>
+            </w:r>
+            <w:r>
+              <w:rPr>
+                <w:noProof/>
+                <w:webHidden/>
+              </w:rPr>
+              <w:fldChar w:fldCharType="begin"/>
+            </w:r>
+            <w:r>
+              <w:rPr>
+                <w:noProof/>
+                <w:webHidden/>
+              </w:rPr>
+              <w:instrText xml:space="preserve"> PAGEREF _Toc231907586 \h </w:instrText>
+            </w:r>
+            <w:r>
+              <w:rPr>
+                <w:noProof/>
+                <w:webHidden/>
+              </w:rPr>
+            </w:r>
+            <w:r>
+              <w:rPr>
+                <w:noProof/>
+                <w:webHidden/>
+              </w:rPr>
+              <w:fldChar w:fldCharType="separate"/>
+            </w:r>
+            <w:r>
+              <w:rPr>
+                <w:noProof/>
+                <w:webHidden/>
+              </w:rPr>
+              <w:t>5</w:t>
+            </w:r>
+            <w:r>
+              <w:rPr>
+                <w:noProof/>
+                <w:webHidden/>
+              </w:rPr>
+              <w:fldChar w:fldCharType="end"/>
+            </w:r>
+          </w:hyperlink>
+        </w:p>
+        <w:p>
+          <w:pPr>
+            <w:pStyle w:val="Verzeichnis2"/>
+            <w:tabs>
+              <w:tab w:val="right" w:leader="dot" w:pos="9062"/>
+            </w:tabs>
+            <w:rPr>
+              <w:rFonts w:eastAsiaTheme="minorEastAsia"/>
+              <w:noProof/>
+              <w:lang w:eastAsia="de-CH"/>
+            </w:rPr>
+          </w:pPr>
+          <w:hyperlink w:anchor="_Toc231907587" w:history="1">
+            <w:r>
+              <w:rPr>
+                <w:rStyle w:val="Hyperlink"/>
+                <w:noProof/>
+              </w:rPr>
+              <w:t>2.2 Erfahrung in verschiedenen Bereichen</w:t>
+            </w:r>
+            <w:r>
+              <w:rPr>
+                <w:noProof/>
+                <w:webHidden/>
+              </w:rPr>
+              <w:tab/>
+            </w:r>
+            <w:r>
+              <w:rPr>
+                <w:noProof/>
+                <w:webHidden/>
+              </w:rPr>
+              <w:fldChar w:fldCharType="begin"/>
+            </w:r>
+            <w:r>
+              <w:rPr>
+                <w:noProof/>
+                <w:webHidden/>
+              </w:rPr>
+              <w:instrText xml:space="preserve"> PAGEREF _Toc231907587 \h </w:instrText>
+            </w:r>
+            <w:r>
+              <w:rPr>
+                <w:noProof/>
+                <w:webHidden/>
+              </w:rPr>
+            </w:r>
+            <w:r>
+              <w:rPr>
+                <w:noProof/>
+                <w:webHidden/>
+              </w:rPr>
+              <w:fldChar w:fldCharType="separate"/>
+            </w:r>
+            <w:r>
+              <w:rPr>
+                <w:noProof/>
+                <w:webHidden/>
+              </w:rPr>
+              <w:t>5</w:t>
+            </w:r>
+            <w:r>
+              <w:rPr>
+                <w:noProof/>
+                <w:webHidden/>
+              </w:rPr>
+              <w:fldChar w:fldCharType="end"/>
+            </w:r>
+          </w:hyperlink>
+        </w:p>
+        <w:p>
+          <w:pPr>
+            <w:pStyle w:val="Verzeichnis2"/>
+            <w:tabs>
+              <w:tab w:val="right" w:leader="dot" w:pos="9062"/>
+            </w:tabs>
+            <w:rPr>
+              <w:rFonts w:eastAsiaTheme="minorEastAsia"/>
+              <w:noProof/>
+              <w:lang w:eastAsia="de-CH"/>
+            </w:rPr>
+          </w:pPr>
+          <w:hyperlink w:anchor="_Toc231907588" w:history="1">
+            <w:r>
+              <w:rPr>
+                <w:rStyle w:val="Hyperlink"/>
+                <w:noProof/>
+              </w:rPr>
+              <w:t>2.3 Zeitdruck</w:t>
+            </w:r>
+            <w:r>
+              <w:rPr>
+                <w:noProof/>
+                <w:webHidden/>
+              </w:rPr>
+              <w:tab/>
+            </w:r>
+            <w:r>
+              <w:rPr>
+                <w:noProof/>
+                <w:webHidden/>
+              </w:rPr>
+              <w:fldChar w:fldCharType="begin"/>
+            </w:r>
+            <w:r>
+              <w:rPr>
+                <w:noProof/>
+                <w:webHidden/>
+              </w:rPr>
+              <w:instrText xml:space="preserve"> PAGEREF _Toc231907588 \h </w:instrText>
+            </w:r>
+            <w:r>
+              <w:rPr>
+                <w:noProof/>
+                <w:webHidden/>
+              </w:rPr>
+            </w:r>
+            <w:r>
+              <w:rPr>
+                <w:noProof/>
+                <w:webHidden/>
+              </w:rPr>
+              <w:fldChar w:fldCharType="separate"/>
+            </w:r>
+            <w:r>
+              <w:rPr>
+                <w:noProof/>
+                <w:webHidden/>
+              </w:rPr>
+              <w:t>5</w:t>
+            </w:r>
+            <w:r>
+              <w:rPr>
+                <w:noProof/>
+                <w:webHidden/>
+              </w:rPr>
+              <w:fldChar w:fldCharType="end"/>
+            </w:r>
+          </w:hyperlink>
+        </w:p>
+        <w:p>
+          <w:pPr>
+            <w:pStyle w:val="Verzeichnis2"/>
+            <w:tabs>
+              <w:tab w:val="right" w:leader="dot" w:pos="9062"/>
+            </w:tabs>
+            <w:rPr>
+              <w:rFonts w:eastAsiaTheme="minorEastAsia"/>
+              <w:noProof/>
+              <w:lang w:eastAsia="de-CH"/>
+            </w:rPr>
+          </w:pPr>
+          <w:hyperlink w:anchor="_Toc231907589" w:history="1">
+            <w:r>
+              <w:rPr>
+                <w:rStyle w:val="Hyperlink"/>
+                <w:noProof/>
+              </w:rPr>
+              <w:t>2.4 Grosse Datenmengen</w:t>
+            </w:r>
+            <w:r>
+              <w:rPr>
+                <w:noProof/>
+                <w:webHidden/>
+              </w:rPr>
+              <w:tab/>
+            </w:r>
+            <w:r>
+              <w:rPr>
+                <w:noProof/>
+                <w:webHidden/>
+              </w:rPr>
+              <w:fldChar w:fldCharType="begin"/>
+            </w:r>
+            <w:r>
+              <w:rPr>
+                <w:noProof/>
+                <w:webHidden/>
+              </w:rPr>
+              <w:instrText xml:space="preserve"> PAGEREF _Toc231907589 \h </w:instrText>
+            </w:r>
+            <w:r>
+              <w:rPr>
+                <w:noProof/>
+                <w:webHidden/>
+              </w:rPr>
+            </w:r>
+            <w:r>
+              <w:rPr>
+                <w:noProof/>
+                <w:webHidden/>
+              </w:rPr>
+              <w:fldChar w:fldCharType="separate"/>
+            </w:r>
+            <w:r>
+              <w:rPr>
+                <w:noProof/>
+                <w:webHidden/>
+              </w:rPr>
+              <w:t>5</w:t>
+            </w:r>
+            <w:r>
+              <w:rPr>
+                <w:noProof/>
+                <w:webHidden/>
+              </w:rPr>
+              <w:fldChar w:fldCharType="end"/>
+            </w:r>
+          </w:hyperlink>
+        </w:p>
+        <w:p>
+          <w:pPr>
+            <w:pStyle w:val="Verzeichnis1"/>
+            <w:tabs>
+              <w:tab w:val="right" w:leader="dot" w:pos="9062"/>
+            </w:tabs>
+            <w:rPr>
+              <w:rFonts w:eastAsiaTheme="minorEastAsia"/>
+              <w:noProof/>
+              <w:lang w:eastAsia="de-CH"/>
+            </w:rPr>
+          </w:pPr>
+          <w:hyperlink w:anchor="_Toc231907590" w:history="1">
+            <w:r>
+              <w:rPr>
+                <w:rStyle w:val="Hyperlink"/>
+                <w:noProof/>
+              </w:rPr>
+              <w:t>3.1 Planung</w:t>
+            </w:r>
+            <w:r>
+              <w:rPr>
+                <w:noProof/>
+                <w:webHidden/>
+              </w:rPr>
+              <w:tab/>
+            </w:r>
+            <w:r>
+              <w:rPr>
+                <w:noProof/>
+                <w:webHidden/>
+              </w:rPr>
+              <w:fldChar w:fldCharType="begin"/>
+            </w:r>
+            <w:r>
+              <w:rPr>
+                <w:noProof/>
+                <w:webHidden/>
+              </w:rPr>
+              <w:instrText xml:space="preserve"> PAGEREF _Toc231907590 \h </w:instrText>
+            </w:r>
+            <w:r>
+              <w:rPr>
+                <w:noProof/>
+                <w:webHidden/>
+              </w:rPr>
+            </w:r>
+            <w:r>
+              <w:rPr>
+                <w:noProof/>
+                <w:webHidden/>
+              </w:rPr>
+              <w:fldChar w:fldCharType="separate"/>
+            </w:r>
+            <w:r>
+              <w:rPr>
+                <w:noProof/>
+                <w:webHidden/>
+              </w:rPr>
+              <w:t>6</w:t>
+            </w:r>
+            <w:r>
+              <w:rPr>
+                <w:noProof/>
+                <w:webHidden/>
+              </w:rPr>
+              <w:fldChar w:fldCharType="end"/>
+            </w:r>
+          </w:hyperlink>
+        </w:p>
+        <w:p>
+          <w:pPr>
+            <w:pStyle w:val="Verzeichnis1"/>
+            <w:tabs>
+              <w:tab w:val="right" w:leader="dot" w:pos="9062"/>
+            </w:tabs>
+            <w:rPr>
+              <w:rFonts w:eastAsiaTheme="minorEastAsia"/>
+              <w:noProof/>
+              <w:lang w:eastAsia="de-CH"/>
+            </w:rPr>
+          </w:pPr>
+          <w:hyperlink w:anchor="_Toc231907591" w:history="1">
+            <w:r>
+              <w:rPr>
+                <w:rStyle w:val="Hyperlink"/>
+                <w:noProof/>
+              </w:rPr>
+              <w:t>4.1Entscheidung</w:t>
+            </w:r>
+            <w:r>
+              <w:rPr>
+                <w:noProof/>
+                <w:webHidden/>
+              </w:rPr>
+              <w:tab/>
+            </w:r>
+            <w:r>
+              <w:rPr>
+                <w:noProof/>
+                <w:webHidden/>
+              </w:rPr>
+              <w:fldChar w:fldCharType="begin"/>
+            </w:r>
+            <w:r>
+              <w:rPr>
+                <w:noProof/>
+                <w:webHidden/>
+              </w:rPr>
+              <w:instrText xml:space="preserve"> PAGEREF _Toc231907591 \h </w:instrText>
+            </w:r>
+            <w:r>
+              <w:rPr>
+                <w:noProof/>
+                <w:webHidden/>
+              </w:rPr>
+            </w:r>
+            <w:r>
+              <w:rPr>
+                <w:noProof/>
+                <w:webHidden/>
+              </w:rPr>
+              <w:fldChar w:fldCharType="separate"/>
+            </w:r>
+            <w:r>
+              <w:rPr>
+                <w:noProof/>
+                <w:webHidden/>
+              </w:rPr>
+              <w:t>6</w:t>
+            </w:r>
+            <w:r>
+              <w:rPr>
+                <w:noProof/>
+                <w:webHidden/>
+              </w:rPr>
+              <w:fldChar w:fldCharType="end"/>
+            </w:r>
+          </w:hyperlink>
+        </w:p>
+        <w:p>
+          <w:pPr>
+            <w:pStyle w:val="Verzeichnis2"/>
+            <w:tabs>
+              <w:tab w:val="right" w:leader="dot" w:pos="9062"/>
+            </w:tabs>
+            <w:rPr>
+              <w:rFonts w:eastAsiaTheme="minorEastAsia"/>
+              <w:noProof/>
+              <w:lang w:eastAsia="de-CH"/>
+            </w:rPr>
+          </w:pPr>
+          <w:hyperlink w:anchor="_Toc231907592" w:history="1">
+            <w:r>
+              <w:rPr>
+                <w:rStyle w:val="Hyperlink"/>
+                <w:noProof/>
+              </w:rPr>
+              <w:t>4.2 Expo oder PWA?</w:t>
+            </w:r>
+            <w:r>
+              <w:rPr>
+                <w:noProof/>
+                <w:webHidden/>
+              </w:rPr>
+              <w:tab/>
+            </w:r>
+            <w:r>
+              <w:rPr>
+                <w:noProof/>
+                <w:webHidden/>
+              </w:rPr>
+              <w:fldChar w:fldCharType="begin"/>
+            </w:r>
+            <w:r>
+              <w:rPr>
+                <w:noProof/>
+                <w:webHidden/>
+              </w:rPr>
+              <w:instrText xml:space="preserve"> PAGEREF _Toc231907592 \h </w:instrText>
+            </w:r>
+            <w:r>
+              <w:rPr>
+                <w:noProof/>
+                <w:webHidden/>
+              </w:rPr>
+            </w:r>
+            <w:r>
+              <w:rPr>
+                <w:noProof/>
+                <w:webHidden/>
+              </w:rPr>
+              <w:fldChar w:fldCharType="separate"/>
+            </w:r>
+            <w:r>
+              <w:rPr>
+                <w:noProof/>
+                <w:webHidden/>
+              </w:rPr>
+              <w:t>6</w:t>
+            </w:r>
+            <w:r>
+              <w:rPr>
+                <w:noProof/>
+                <w:webHidden/>
+              </w:rPr>
+              <w:fldChar w:fldCharType="end"/>
+            </w:r>
+          </w:hyperlink>
+        </w:p>
+        <w:p>
+          <w:pPr>
+            <w:pStyle w:val="Verzeichnis2"/>
+            <w:tabs>
+              <w:tab w:val="right" w:leader="dot" w:pos="9062"/>
+            </w:tabs>
+            <w:rPr>
+              <w:rFonts w:eastAsiaTheme="minorEastAsia"/>
+              <w:noProof/>
+              <w:lang w:eastAsia="de-CH"/>
+            </w:rPr>
+          </w:pPr>
+          <w:hyperlink w:anchor="_Toc231907593" w:history="1">
+            <w:r>
+              <w:rPr>
+                <w:rStyle w:val="Hyperlink"/>
+                <w:noProof/>
+              </w:rPr>
+              <w:t>4.3 Erklärung von PWA</w:t>
+            </w:r>
+            <w:r>
+              <w:rPr>
+                <w:noProof/>
+                <w:webHidden/>
+              </w:rPr>
+              <w:tab/>
+            </w:r>
+            <w:r>
+              <w:rPr>
+                <w:noProof/>
+                <w:webHidden/>
+              </w:rPr>
+              <w:fldChar w:fldCharType="begin"/>
+            </w:r>
+            <w:r>
+              <w:rPr>
+                <w:noProof/>
+                <w:webHidden/>
+              </w:rPr>
+              <w:instrText xml:space="preserve"> PAGEREF _Toc231907593 \h </w:instrText>
+            </w:r>
+            <w:r>
+              <w:rPr>
+                <w:noProof/>
+                <w:webHidden/>
+              </w:rPr>
+            </w:r>
+            <w:r>
+              <w:rPr>
+                <w:noProof/>
+                <w:webHidden/>
+              </w:rPr>
+              <w:fldChar w:fldCharType="separate"/>
+            </w:r>
+            <w:r>
+              <w:rPr>
+                <w:noProof/>
+                <w:webHidden/>
+              </w:rPr>
+              <w:t>6</w:t>
+            </w:r>
+            <w:r>
+              <w:rPr>
+                <w:noProof/>
+                <w:webHidden/>
+              </w:rPr>
+              <w:fldChar w:fldCharType="end"/>
+            </w:r>
+          </w:hyperlink>
+        </w:p>
+        <w:p>
+          <w:pPr>
+            <w:pStyle w:val="Verzeichnis2"/>
+            <w:tabs>
+              <w:tab w:val="right" w:leader="dot" w:pos="9062"/>
+            </w:tabs>
+            <w:rPr>
+              <w:rFonts w:eastAsiaTheme="minorEastAsia"/>
+              <w:noProof/>
+              <w:lang w:eastAsia="de-CH"/>
+            </w:rPr>
+          </w:pPr>
+          <w:hyperlink w:anchor="_Toc231907594" w:history="1">
+            <w:r>
+              <w:rPr>
+                <w:rStyle w:val="Hyperlink"/>
+                <w:noProof/>
+              </w:rPr>
+              <w:t>4.4 Hosting der Webseite</w:t>
+            </w:r>
+            <w:r>
+              <w:rPr>
+                <w:noProof/>
+                <w:webHidden/>
+              </w:rPr>
+              <w:tab/>
+            </w:r>
+            <w:r>
+              <w:rPr>
+                <w:noProof/>
+                <w:webHidden/>
+              </w:rPr>
+              <w:fldChar w:fldCharType="begin"/>
+            </w:r>
+            <w:r>
+              <w:rPr>
+                <w:noProof/>
+                <w:webHidden/>
+              </w:rPr>
+              <w:instrText xml:space="preserve"> PAGEREF _Toc231907594 \h </w:instrText>
+            </w:r>
+            <w:r>
+              <w:rPr>
+                <w:noProof/>
+                <w:webHidden/>
+              </w:rPr>
+            </w:r>
+            <w:r>
+              <w:rPr>
+                <w:noProof/>
+                <w:webHidden/>
+              </w:rPr>
+              <w:fldChar w:fldCharType="separate"/>
+            </w:r>
+            <w:r>
+              <w:rPr>
+                <w:noProof/>
+                <w:webHidden/>
+              </w:rPr>
+              <w:t>6</w:t>
+            </w:r>
+            <w:r>
+              <w:rPr>
+                <w:noProof/>
+                <w:webHidden/>
+              </w:rPr>
+              <w:fldChar w:fldCharType="end"/>
+            </w:r>
+          </w:hyperlink>
+        </w:p>
+        <w:p>
+          <w:pPr>
+            <w:pStyle w:val="Verzeichnis2"/>
+            <w:tabs>
+              <w:tab w:val="right" w:leader="dot" w:pos="9062"/>
+            </w:tabs>
+            <w:rPr>
+              <w:rFonts w:eastAsiaTheme="minorEastAsia"/>
+              <w:noProof/>
+              <w:lang w:eastAsia="de-CH"/>
+            </w:rPr>
+          </w:pPr>
+          <w:hyperlink w:anchor="_Toc231907595" w:history="1">
+            <w:r>
+              <w:rPr>
+                <w:rStyle w:val="Hyperlink"/>
+                <w:noProof/>
+              </w:rPr>
+              <w:t>4.5 Entschluss meiner Entscheidungen</w:t>
+            </w:r>
+            <w:r>
+              <w:rPr>
+                <w:noProof/>
+                <w:webHidden/>
+              </w:rPr>
+              <w:tab/>
+            </w:r>
+            <w:r>
+              <w:rPr>
+                <w:noProof/>
+                <w:webHidden/>
+              </w:rPr>
+              <w:fldChar w:fldCharType="begin"/>
+            </w:r>
+            <w:r>
+              <w:rPr>
+                <w:noProof/>
+                <w:webHidden/>
+              </w:rPr>
+              <w:instrText xml:space="preserve"> PAGEREF _Toc231907595 \h </w:instrText>
+            </w:r>
+            <w:r>
+              <w:rPr>
+                <w:noProof/>
+                <w:webHidden/>
+              </w:rPr>
+            </w:r>
+            <w:r>
+              <w:rPr>
+                <w:noProof/>
+                <w:webHidden/>
+              </w:rPr>
+              <w:fldChar w:fldCharType="separate"/>
+            </w:r>
+            <w:r>
+              <w:rPr>
+                <w:noProof/>
+                <w:webHidden/>
+              </w:rPr>
+              <w:t>7</w:t>
             </w:r>
             <w:r>
               <w:rPr>
@@ -860,69 +2196,1230 @@
         </w:p>
       </w:sdtContent>
     </w:sdt>
-    <w:p>
-      <w:r>
+    <w:tbl>
+      <w:tblPr>
+        <w:tblStyle w:val="Tabellenraster"/>
+        <w:tblW w:w="0" w:type="auto"/>
+        <w:tblLook w:val="04A0" w:firstRow="1" w:lastRow="0" w:firstColumn="1" w:lastColumn="0" w:noHBand="0" w:noVBand="1"/>
+      </w:tblPr>
+      <w:tblGrid>
+        <w:gridCol w:w="3020"/>
+        <w:gridCol w:w="3021"/>
+        <w:gridCol w:w="3021"/>
+      </w:tblGrid>
+      <w:tr>
+        <w:tc>
+          <w:tcPr>
+            <w:tcW w:w="3020" w:type="dxa"/>
+          </w:tcPr>
+          <w:p>
+            <w:r>
+              <w:t xml:space="preserve">Datum </w:t>
+            </w:r>
+          </w:p>
+        </w:tc>
+        <w:tc>
+          <w:tcPr>
+            <w:tcW w:w="3021" w:type="dxa"/>
+          </w:tcPr>
+          <w:p>
+            <w:r>
+              <w:t xml:space="preserve">Beschreibung </w:t>
+            </w:r>
+          </w:p>
+        </w:tc>
+        <w:tc>
+          <w:tcPr>
+            <w:tcW w:w="3021" w:type="dxa"/>
+          </w:tcPr>
+          <w:p>
+            <w:r>
+              <w:t xml:space="preserve">Version </w:t>
+            </w:r>
+          </w:p>
+        </w:tc>
+      </w:tr>
+      <w:tr>
+        <w:tc>
+          <w:tcPr>
+            <w:tcW w:w="3020" w:type="dxa"/>
+          </w:tcPr>
+          <w:p>
+            <w:r>
+              <w:t>08.06.2026</w:t>
+            </w:r>
+          </w:p>
+        </w:tc>
+        <w:tc>
+          <w:tcPr>
+            <w:tcW w:w="3021" w:type="dxa"/>
+          </w:tcPr>
+          <w:p>
+            <w:r>
+              <w:t>Dokumentation erstellt</w:t>
+            </w:r>
+          </w:p>
+        </w:tc>
+        <w:tc>
+          <w:tcPr>
+            <w:tcW w:w="3021" w:type="dxa"/>
+          </w:tcPr>
+          <w:p>
+            <w:r>
+              <w:t xml:space="preserve">1.0 </w:t>
+            </w:r>
+          </w:p>
+        </w:tc>
+      </w:tr>
+      <w:tr>
+        <w:tc>
+          <w:tcPr>
+            <w:tcW w:w="3020" w:type="dxa"/>
+          </w:tcPr>
+          <w:p>
+            <w:r>
+              <w:t>08.06.2026</w:t>
+            </w:r>
+          </w:p>
+        </w:tc>
+        <w:tc>
+          <w:tcPr>
+            <w:tcW w:w="3021" w:type="dxa"/>
+          </w:tcPr>
+          <w:p>
+            <w:r>
+              <w:t>Kapitel 1.1- 2.</w:t>
+            </w:r>
+            <w:r>
+              <w:t>4</w:t>
+            </w:r>
+            <w:r>
+              <w:t xml:space="preserve"> geschrieben </w:t>
+            </w:r>
+          </w:p>
+        </w:tc>
+        <w:tc>
+          <w:tcPr>
+            <w:tcW w:w="3021" w:type="dxa"/>
+          </w:tcPr>
+          <w:p>
+            <w:r>
+              <w:t>1.</w:t>
+            </w:r>
+            <w:r>
+              <w:t>0</w:t>
+            </w:r>
+          </w:p>
+        </w:tc>
+      </w:tr>
+      <w:tr>
+        <w:tc>
+          <w:tcPr>
+            <w:tcW w:w="3020" w:type="dxa"/>
+          </w:tcPr>
+          <w:p>
+            <w:r>
+              <w:t>09.06.2026</w:t>
+            </w:r>
+          </w:p>
+        </w:tc>
+        <w:tc>
+          <w:tcPr>
+            <w:tcW w:w="3021" w:type="dxa"/>
+          </w:tcPr>
+          <w:p>
+            <w:r>
+              <w:t>Kapitel 3.1-</w:t>
+            </w:r>
+            <w:r>
+              <w:t>4.1</w:t>
+            </w:r>
+          </w:p>
+        </w:tc>
+        <w:tc>
+          <w:tcPr>
+            <w:tcW w:w="3021" w:type="dxa"/>
+          </w:tcPr>
+          <w:p>
+            <w:r>
+              <w:t>1.1</w:t>
+            </w:r>
+          </w:p>
+        </w:tc>
+      </w:tr>
+      <w:tr>
+        <w:tc>
+          <w:tcPr>
+            <w:tcW w:w="3020" w:type="dxa"/>
+          </w:tcPr>
+          <w:p/>
+        </w:tc>
+        <w:tc>
+          <w:tcPr>
+            <w:tcW w:w="3021" w:type="dxa"/>
+          </w:tcPr>
+          <w:p/>
+        </w:tc>
+        <w:tc>
+          <w:tcPr>
+            <w:tcW w:w="3021" w:type="dxa"/>
+          </w:tcPr>
+          <w:p/>
+        </w:tc>
+      </w:tr>
+      <w:tr>
+        <w:tc>
+          <w:tcPr>
+            <w:tcW w:w="3020" w:type="dxa"/>
+          </w:tcPr>
+          <w:p/>
+        </w:tc>
+        <w:tc>
+          <w:tcPr>
+            <w:tcW w:w="3021" w:type="dxa"/>
+          </w:tcPr>
+          <w:p/>
+        </w:tc>
+        <w:tc>
+          <w:tcPr>
+            <w:tcW w:w="3021" w:type="dxa"/>
+          </w:tcPr>
+          <w:p/>
+        </w:tc>
+      </w:tr>
+    </w:tbl>
+    <w:p/>
+    <w:p/>
+    <w:p>
+      <w:r>
+        <w:lastRenderedPageBreak/>
         <w:br w:type="page"/>
       </w:r>
     </w:p>
+    <w:p>
+      <w:pPr>
+        <w:pStyle w:val="berschrift1"/>
+        <w:numPr>
+          <w:ilvl w:val="1"/>
+          <w:numId w:val="1"/>
+        </w:numPr>
+      </w:pPr>
+      <w:bookmarkStart w:id="0" w:name="_Toc231907574"/>
+      <w:r>
+        <w:lastRenderedPageBreak/>
+        <w:t>Projektbeschreibung</w:t>
+      </w:r>
+      <w:bookmarkEnd w:id="0"/>
+      <w:r>
+        <w:t xml:space="preserve"> </w:t>
+      </w:r>
+    </w:p>
+    <w:p>
+      <w:r>
+        <w:t xml:space="preserve">In diesem Projekt wird eine webbasierte </w:t>
+      </w:r>
+      <w:r>
+        <w:rPr>
+          <w:b/>
+          <w:bCs/>
+        </w:rPr>
+        <w:t>F1 Statistik- und Analyseplattform</w:t>
+      </w:r>
+      <w:r>
+        <w:t xml:space="preserve"> entwickelt. Die Anwendung ermöglicht es, Daten aus der Formel 1 (Fahrer, Teams, Rennen und Ergebnisse) übersichtlich darzustellen, zu filtern und statistisch auszuwerten.</w:t>
+      </w:r>
+    </w:p>
+    <w:p>
+      <w:r>
+        <w:t>Ziel ist es, eine interaktive Web-App zu erstellen, die reale Daten aus einem externen Dataset nutzt und diese in einer modernen Benutzeroberfläche visualisiert.</w:t>
+      </w:r>
+    </w:p>
+    <w:p>
+      <w:pPr>
+        <w:pStyle w:val="berschrift2"/>
+      </w:pPr>
+      <w:bookmarkStart w:id="1" w:name="_Toc231907575"/>
+      <w:r>
+        <w:t xml:space="preserve">1.2 </w:t>
+      </w:r>
+      <w:r>
+        <w:t>Ziel des Projekts</w:t>
+      </w:r>
+      <w:bookmarkEnd w:id="1"/>
+    </w:p>
+    <w:p>
+      <w:r>
+        <w:t>Das Ziel ist es, eine vollständige Full-Stack Anwendung zu entwickeln, die folgende Funktionen bietet:</w:t>
+      </w:r>
+    </w:p>
+    <w:p>
+      <w:pPr>
+        <w:pStyle w:val="Listenabsatz"/>
+        <w:numPr>
+          <w:ilvl w:val="0"/>
+          <w:numId w:val="2"/>
+        </w:numPr>
+      </w:pPr>
+      <w:r>
+        <w:t xml:space="preserve">Anzeige von F1 Fahrern, Teams und Rennen </w:t>
+      </w:r>
+    </w:p>
+    <w:p>
+      <w:pPr>
+        <w:pStyle w:val="Listenabsatz"/>
+        <w:numPr>
+          <w:ilvl w:val="0"/>
+          <w:numId w:val="2"/>
+        </w:numPr>
+      </w:pPr>
+      <w:r>
+        <w:t xml:space="preserve">Darstellung von Rennergebnissen </w:t>
+      </w:r>
+    </w:p>
+    <w:p>
+      <w:pPr>
+        <w:pStyle w:val="Listenabsatz"/>
+        <w:numPr>
+          <w:ilvl w:val="0"/>
+          <w:numId w:val="2"/>
+        </w:numPr>
+      </w:pPr>
+      <w:r>
+        <w:t xml:space="preserve">Filter- und Suchfunktionen </w:t>
+      </w:r>
+    </w:p>
+    <w:p>
+      <w:pPr>
+        <w:pStyle w:val="Listenabsatz"/>
+        <w:numPr>
+          <w:ilvl w:val="0"/>
+          <w:numId w:val="2"/>
+        </w:numPr>
+      </w:pPr>
+      <w:r>
+        <w:t xml:space="preserve">Login-System für Benutzer </w:t>
+      </w:r>
+    </w:p>
+    <w:p>
+      <w:pPr>
+        <w:pStyle w:val="Listenabsatz"/>
+        <w:numPr>
+          <w:ilvl w:val="0"/>
+          <w:numId w:val="2"/>
+        </w:numPr>
+      </w:pPr>
+      <w:r>
+        <w:t xml:space="preserve">Statistik-Dashboard mit Auswertungen </w:t>
+      </w:r>
+    </w:p>
+    <w:p>
+      <w:pPr>
+        <w:pStyle w:val="Listenabsatz"/>
+        <w:numPr>
+          <w:ilvl w:val="0"/>
+          <w:numId w:val="2"/>
+        </w:numPr>
+      </w:pPr>
+      <w:r>
+        <w:t xml:space="preserve">Diagramme zur Visualisierung von Daten </w:t>
+      </w:r>
+    </w:p>
+    <w:p>
+      <w:pPr>
+        <w:pStyle w:val="Listenabsatz"/>
+        <w:numPr>
+          <w:ilvl w:val="0"/>
+          <w:numId w:val="2"/>
+        </w:numPr>
+      </w:pPr>
+      <w:r>
+        <w:t xml:space="preserve">Bereitstellung als installierbare Web-App (PWA) </w:t>
+      </w:r>
+    </w:p>
+    <w:p>
+      <w:pPr>
+        <w:pStyle w:val="berschrift2"/>
+      </w:pPr>
+      <w:bookmarkStart w:id="2" w:name="_Toc231907576"/>
+      <w:r>
+        <w:t xml:space="preserve">1.3 </w:t>
+      </w:r>
+      <w:r>
+        <w:t>Verwendete Technologien</w:t>
+      </w:r>
+      <w:bookmarkEnd w:id="2"/>
+    </w:p>
+    <w:p>
+      <w:pPr>
+        <w:pStyle w:val="berschrift3"/>
+      </w:pPr>
+      <w:bookmarkStart w:id="3" w:name="_Toc231907577"/>
+      <w:r>
+        <w:t>1.3</w:t>
+      </w:r>
+      <w:r>
+        <w:t>.</w:t>
+      </w:r>
+      <w:r>
+        <w:t>1</w:t>
+      </w:r>
+      <w:r>
+        <w:t xml:space="preserve"> </w:t>
+      </w:r>
+      <w:r>
+        <w:t>Frontend</w:t>
+      </w:r>
+      <w:bookmarkEnd w:id="3"/>
+    </w:p>
+    <w:p>
+      <w:pPr>
+        <w:pStyle w:val="Listenabsatz"/>
+        <w:numPr>
+          <w:ilvl w:val="0"/>
+          <w:numId w:val="3"/>
+        </w:numPr>
+      </w:pPr>
+      <w:r>
+        <w:rPr>
+          <w:b/>
+          <w:bCs/>
+        </w:rPr>
+        <w:t>React (Vite)</w:t>
+      </w:r>
+      <w:r>
+        <w:br/>
+        <w:t xml:space="preserve">→ Für den Aufbau der Benutzeroberfläche </w:t>
+      </w:r>
+    </w:p>
+    <w:p>
+      <w:pPr>
+        <w:pStyle w:val="Listenabsatz"/>
+        <w:numPr>
+          <w:ilvl w:val="0"/>
+          <w:numId w:val="3"/>
+        </w:numPr>
+      </w:pPr>
+      <w:r>
+        <w:rPr>
+          <w:b/>
+          <w:bCs/>
+        </w:rPr>
+        <w:t>HTML &amp; CSS</w:t>
+      </w:r>
+      <w:r>
+        <w:br/>
+        <w:t xml:space="preserve">→ Für Struktur und Design </w:t>
+      </w:r>
+    </w:p>
+    <w:p>
+      <w:pPr>
+        <w:pStyle w:val="Listenabsatz"/>
+        <w:numPr>
+          <w:ilvl w:val="0"/>
+          <w:numId w:val="3"/>
+        </w:numPr>
+      </w:pPr>
+      <w:r>
+        <w:rPr>
+          <w:b/>
+          <w:bCs/>
+        </w:rPr>
+        <w:t>JavaScript (ES6+)</w:t>
+      </w:r>
+      <w:r>
+        <w:br/>
+        <w:t xml:space="preserve">→ Für Logik und Datenverarbeitung </w:t>
+      </w:r>
+    </w:p>
+    <w:p>
+      <w:pPr>
+        <w:pStyle w:val="Listenabsatz"/>
+        <w:numPr>
+          <w:ilvl w:val="0"/>
+          <w:numId w:val="3"/>
+        </w:numPr>
+      </w:pPr>
+      <w:r>
+        <w:rPr>
+          <w:b/>
+          <w:bCs/>
+        </w:rPr>
+        <w:t>React Router</w:t>
+      </w:r>
+      <w:r>
+        <w:br/>
+        <w:t xml:space="preserve">→ Für Navigation zwischen Seiten </w:t>
+      </w:r>
+    </w:p>
+    <w:p>
+      <w:pPr>
+        <w:pStyle w:val="Listenabsatz"/>
+        <w:numPr>
+          <w:ilvl w:val="0"/>
+          <w:numId w:val="3"/>
+        </w:numPr>
+      </w:pPr>
+      <w:r>
+        <w:rPr>
+          <w:b/>
+          <w:bCs/>
+        </w:rPr>
+        <w:t>Chart.js / Recharts</w:t>
+      </w:r>
+      <w:r>
+        <w:br/>
+        <w:t xml:space="preserve">→ Für Diagramme und Statistiken </w:t>
+      </w:r>
+    </w:p>
+    <w:p>
+      <w:pPr>
+        <w:pStyle w:val="berschrift3"/>
+        <w:rPr>
+          <w:lang w:val="en-US"/>
+        </w:rPr>
+      </w:pPr>
+      <w:bookmarkStart w:id="4" w:name="_Toc231907578"/>
+      <w:r>
+        <w:rPr>
+          <w:lang w:val="en-US"/>
+        </w:rPr>
+        <w:t>1.</w:t>
+      </w:r>
+      <w:r>
+        <w:rPr>
+          <w:lang w:val="en-US"/>
+        </w:rPr>
+        <w:t>3.2</w:t>
+      </w:r>
+      <w:r>
+        <w:rPr>
+          <w:lang w:val="en-US"/>
+        </w:rPr>
+        <w:t>Backend (Backend-as-a-Service)</w:t>
+      </w:r>
+      <w:bookmarkEnd w:id="4"/>
+    </w:p>
+    <w:p>
+      <w:pPr>
+        <w:pStyle w:val="Listenabsatz"/>
+        <w:numPr>
+          <w:ilvl w:val="0"/>
+          <w:numId w:val="4"/>
+        </w:numPr>
+      </w:pPr>
+      <w:r>
+        <w:rPr>
+          <w:b/>
+          <w:bCs/>
+        </w:rPr>
+        <w:t>Supabase</w:t>
+      </w:r>
+      <w:r>
+        <w:br/>
+        <w:t xml:space="preserve">→ Datenbank + API + Authentifizierung </w:t>
+      </w:r>
+    </w:p>
+    <w:p>
+      <w:pPr>
+        <w:pStyle w:val="Listenabsatz"/>
+        <w:numPr>
+          <w:ilvl w:val="0"/>
+          <w:numId w:val="4"/>
+        </w:numPr>
+      </w:pPr>
+      <w:r>
+        <w:rPr>
+          <w:b/>
+          <w:bCs/>
+        </w:rPr>
+        <w:t>PostgreSQL (Supabase Database)</w:t>
+      </w:r>
+      <w:r>
+        <w:br/>
+        <w:t xml:space="preserve">→ Speicherung der F1 Daten </w:t>
+      </w:r>
+    </w:p>
+    <w:p>
+      <w:pPr>
+        <w:pStyle w:val="berschrift3"/>
+      </w:pPr>
+      <w:bookmarkStart w:id="5" w:name="_Toc231907579"/>
+      <w:r>
+        <w:lastRenderedPageBreak/>
+        <w:t>1.</w:t>
+      </w:r>
+      <w:r>
+        <w:t>3.3</w:t>
+      </w:r>
+      <w:r>
+        <w:t xml:space="preserve"> </w:t>
+      </w:r>
+      <w:r>
+        <w:t>Datenquelle</w:t>
+      </w:r>
+      <w:bookmarkEnd w:id="5"/>
+    </w:p>
+    <w:p>
+      <w:pPr>
+        <w:pStyle w:val="Listenabsatz"/>
+        <w:numPr>
+          <w:ilvl w:val="0"/>
+          <w:numId w:val="5"/>
+        </w:numPr>
+      </w:pPr>
+      <w:r>
+        <w:rPr>
+          <w:b/>
+          <w:bCs/>
+        </w:rPr>
+        <w:t>Ergast F1 Dataset</w:t>
+      </w:r>
+      <w:r>
+        <w:br/>
+        <w:t xml:space="preserve">→ Enthält echte Formel-1 Daten wie Fahrer, Rennen und Ergebnisse </w:t>
+      </w:r>
+    </w:p>
+    <w:p>
+      <w:pPr>
+        <w:pStyle w:val="berschrift3"/>
+      </w:pPr>
+      <w:bookmarkStart w:id="6" w:name="_Toc231907580"/>
+      <w:r>
+        <w:t>1.</w:t>
+      </w:r>
+      <w:r>
+        <w:t>3.4</w:t>
+      </w:r>
+      <w:r>
+        <w:t xml:space="preserve"> </w:t>
+      </w:r>
+      <w:r>
+        <w:t>Authentifizierung</w:t>
+      </w:r>
+      <w:bookmarkEnd w:id="6"/>
+    </w:p>
+    <w:p>
+      <w:pPr>
+        <w:pStyle w:val="Listenabsatz"/>
+        <w:numPr>
+          <w:ilvl w:val="0"/>
+          <w:numId w:val="5"/>
+        </w:numPr>
+      </w:pPr>
+      <w:r>
+        <w:rPr>
+          <w:b/>
+          <w:bCs/>
+        </w:rPr>
+        <w:t>Supabase Auth</w:t>
+      </w:r>
+      <w:r>
+        <w:br/>
+        <w:t xml:space="preserve">→ Login- und Registrierungssystem für Benutzer </w:t>
+      </w:r>
+    </w:p>
+    <w:p>
+      <w:pPr>
+        <w:pStyle w:val="berschrift3"/>
+      </w:pPr>
+      <w:bookmarkStart w:id="7" w:name="_Toc231907581"/>
+      <w:r>
+        <w:t>1.</w:t>
+      </w:r>
+      <w:r>
+        <w:t>3.5</w:t>
+      </w:r>
+      <w:r>
+        <w:t>Deployment</w:t>
+      </w:r>
+      <w:bookmarkEnd w:id="7"/>
+    </w:p>
+    <w:p>
+      <w:pPr>
+        <w:pStyle w:val="Listenabsatz"/>
+        <w:numPr>
+          <w:ilvl w:val="0"/>
+          <w:numId w:val="5"/>
+        </w:numPr>
+      </w:pPr>
+      <w:r>
+        <w:rPr>
+          <w:b/>
+          <w:bCs/>
+        </w:rPr>
+        <w:t>GitHub Pages</w:t>
+      </w:r>
+      <w:r>
+        <w:br/>
+        <w:t xml:space="preserve">→ Hosting der Web-App </w:t>
+      </w:r>
+    </w:p>
+    <w:p>
+      <w:pPr>
+        <w:pStyle w:val="Listenabsatz"/>
+        <w:numPr>
+          <w:ilvl w:val="0"/>
+          <w:numId w:val="5"/>
+        </w:numPr>
+      </w:pPr>
+      <w:r>
+        <w:rPr>
+          <w:b/>
+          <w:bCs/>
+        </w:rPr>
+        <w:t>PWA (Progressive Web App)</w:t>
+      </w:r>
+      <w:r>
+        <w:br/>
+        <w:t xml:space="preserve">→ App kann auf Desktop und Handy installiert werden </w:t>
+      </w:r>
+    </w:p>
+    <w:p>
+      <w:pPr>
+        <w:pStyle w:val="berschrift2"/>
+      </w:pPr>
+      <w:bookmarkStart w:id="8" w:name="_Toc231907582"/>
+      <w:r>
+        <w:t xml:space="preserve">1.4 </w:t>
+      </w:r>
+      <w:r>
+        <w:t>Architektur</w:t>
+      </w:r>
+      <w:bookmarkEnd w:id="8"/>
+    </w:p>
+    <w:p>
+      <w:r>
+        <w:t>Die Anwendung ist wie folgt aufgebaut:</w:t>
+      </w:r>
+    </w:p>
+    <w:p>
+      <w:pPr>
+        <w:pStyle w:val="Listenabsatz"/>
+        <w:numPr>
+          <w:ilvl w:val="0"/>
+          <w:numId w:val="6"/>
+        </w:numPr>
+      </w:pPr>
+      <w:r>
+        <w:t xml:space="preserve">Das </w:t>
+      </w:r>
+      <w:r>
+        <w:rPr>
+          <w:b/>
+          <w:bCs/>
+        </w:rPr>
+        <w:t>Frontend (React)</w:t>
+      </w:r>
+      <w:r>
+        <w:t xml:space="preserve"> stellt die Benutzeroberfläche dar </w:t>
+      </w:r>
+    </w:p>
+    <w:p>
+      <w:pPr>
+        <w:pStyle w:val="Listenabsatz"/>
+        <w:numPr>
+          <w:ilvl w:val="0"/>
+          <w:numId w:val="6"/>
+        </w:numPr>
+      </w:pPr>
+      <w:r>
+        <w:t xml:space="preserve">Die </w:t>
+      </w:r>
+      <w:r>
+        <w:rPr>
+          <w:b/>
+          <w:bCs/>
+        </w:rPr>
+        <w:t>Supabase API</w:t>
+      </w:r>
+      <w:r>
+        <w:t xml:space="preserve"> liefert die Daten </w:t>
+      </w:r>
+    </w:p>
+    <w:p>
+      <w:pPr>
+        <w:pStyle w:val="Listenabsatz"/>
+        <w:numPr>
+          <w:ilvl w:val="0"/>
+          <w:numId w:val="6"/>
+        </w:numPr>
+      </w:pPr>
+      <w:r>
+        <w:t xml:space="preserve">Die </w:t>
+      </w:r>
+      <w:r>
+        <w:rPr>
+          <w:b/>
+          <w:bCs/>
+        </w:rPr>
+        <w:t>PostgreSQL Datenbank</w:t>
+      </w:r>
+      <w:r>
+        <w:t xml:space="preserve"> speichert alle F1 Informationen </w:t>
+      </w:r>
+    </w:p>
+    <w:p>
+      <w:pPr>
+        <w:pStyle w:val="Listenabsatz"/>
+        <w:numPr>
+          <w:ilvl w:val="0"/>
+          <w:numId w:val="6"/>
+        </w:numPr>
+      </w:pPr>
+      <w:r>
+        <w:t xml:space="preserve">Das Frontend kommuniziert direkt mit Supabase </w:t>
+      </w:r>
+    </w:p>
+    <w:p>
+      <w:pPr>
+        <w:pStyle w:val="berschrift2"/>
+      </w:pPr>
+      <w:bookmarkStart w:id="9" w:name="_Toc231907583"/>
+      <w:r>
+        <w:t xml:space="preserve">1.5 </w:t>
+      </w:r>
+      <w:r>
+        <w:t>Datenstruktur</w:t>
+      </w:r>
+      <w:bookmarkEnd w:id="9"/>
+    </w:p>
+    <w:p>
+      <w:r>
+        <w:t>Die Datenbank besteht aus mehreren miteinander verbundenen Tabellen:</w:t>
+      </w:r>
+    </w:p>
+    <w:p>
+      <w:pPr>
+        <w:pStyle w:val="Listenabsatz"/>
+        <w:numPr>
+          <w:ilvl w:val="0"/>
+          <w:numId w:val="7"/>
+        </w:numPr>
+      </w:pPr>
+      <w:r>
+        <w:t xml:space="preserve">Drivers (Fahrer) </w:t>
+      </w:r>
+    </w:p>
+    <w:p>
+      <w:pPr>
+        <w:pStyle w:val="Listenabsatz"/>
+        <w:numPr>
+          <w:ilvl w:val="0"/>
+          <w:numId w:val="7"/>
+        </w:numPr>
+      </w:pPr>
+      <w:r>
+        <w:t xml:space="preserve">Constructors (Teams) </w:t>
+      </w:r>
+    </w:p>
+    <w:p>
+      <w:pPr>
+        <w:pStyle w:val="Listenabsatz"/>
+        <w:numPr>
+          <w:ilvl w:val="0"/>
+          <w:numId w:val="7"/>
+        </w:numPr>
+      </w:pPr>
+      <w:r>
+        <w:t xml:space="preserve">Races (Rennen) </w:t>
+      </w:r>
+    </w:p>
+    <w:p>
+      <w:pPr>
+        <w:pStyle w:val="Listenabsatz"/>
+        <w:numPr>
+          <w:ilvl w:val="0"/>
+          <w:numId w:val="7"/>
+        </w:numPr>
+      </w:pPr>
+      <w:r>
+        <w:t xml:space="preserve">Results (Ergebnisse) </w:t>
+      </w:r>
+    </w:p>
+    <w:p>
+      <w:r>
+        <w:t>Diese Tabellen sind miteinander verknüpft und ermöglichen komplexe Auswertungen.</w:t>
+      </w:r>
+    </w:p>
+    <w:p>
+      <w:pPr>
+        <w:pStyle w:val="berschrift2"/>
+      </w:pPr>
+      <w:bookmarkStart w:id="10" w:name="_Toc231907584"/>
+      <w:r>
+        <w:t xml:space="preserve">1.6 </w:t>
+      </w:r>
+      <w:r>
+        <w:t>Besonderheiten des Projekts</w:t>
+      </w:r>
+      <w:bookmarkEnd w:id="10"/>
+    </w:p>
+    <w:p>
+      <w:pPr>
+        <w:pStyle w:val="Listenabsatz"/>
+        <w:numPr>
+          <w:ilvl w:val="0"/>
+          <w:numId w:val="8"/>
+        </w:numPr>
+      </w:pPr>
+      <w:r>
+        <w:t xml:space="preserve">Nutzung echter F1 Daten </w:t>
+      </w:r>
+    </w:p>
+    <w:p>
+      <w:pPr>
+        <w:pStyle w:val="Listenabsatz"/>
+        <w:numPr>
+          <w:ilvl w:val="0"/>
+          <w:numId w:val="8"/>
+        </w:numPr>
+      </w:pPr>
+      <w:r>
+        <w:t xml:space="preserve">Komplexes relationales Datenmodell </w:t>
+      </w:r>
+    </w:p>
+    <w:p>
+      <w:pPr>
+        <w:pStyle w:val="Listenabsatz"/>
+        <w:numPr>
+          <w:ilvl w:val="0"/>
+          <w:numId w:val="8"/>
+        </w:numPr>
+      </w:pPr>
+      <w:r>
+        <w:t xml:space="preserve">Dashboard mit Statistiken und Diagrammen </w:t>
+      </w:r>
+    </w:p>
+    <w:p>
+      <w:pPr>
+        <w:pStyle w:val="Listenabsatz"/>
+        <w:numPr>
+          <w:ilvl w:val="0"/>
+          <w:numId w:val="8"/>
+        </w:numPr>
+      </w:pPr>
+      <w:r>
+        <w:t xml:space="preserve">Benutzerlogin-System </w:t>
+      </w:r>
+    </w:p>
+    <w:p>
+      <w:pPr>
+        <w:pStyle w:val="Listenabsatz"/>
+        <w:numPr>
+          <w:ilvl w:val="0"/>
+          <w:numId w:val="8"/>
+        </w:numPr>
+      </w:pPr>
+      <w:r>
+        <w:t xml:space="preserve">Moderne Web-App als PWA </w:t>
+      </w:r>
+    </w:p>
+    <w:p>
+      <w:pPr>
+        <w:pStyle w:val="Listenabsatz"/>
+        <w:numPr>
+          <w:ilvl w:val="0"/>
+          <w:numId w:val="8"/>
+        </w:numPr>
+      </w:pPr>
+      <w:r>
+        <w:t xml:space="preserve">Cloud-basierte Datenbank (Supabase) </w:t>
+      </w:r>
+    </w:p>
+    <w:p>
+      <w:pPr>
+        <w:pStyle w:val="berschrift2"/>
+      </w:pPr>
+      <w:bookmarkStart w:id="11" w:name="_Toc231907585"/>
+      <w:r>
+        <w:lastRenderedPageBreak/>
+        <w:t xml:space="preserve">1.7 </w:t>
+      </w:r>
+      <w:r>
+        <w:t>Zusammenfassung</w:t>
+      </w:r>
+      <w:bookmarkEnd w:id="11"/>
+    </w:p>
+    <w:p>
+      <w:r>
+        <w:t>Dieses Projekt ist eine moderne Full-Stack Webanwendung zur Analyse von Formel-1 Daten. Es kombiniert Frontend-Entwicklung, Datenbankdesign, API-Nutzung und Datenvisualisierung in einem realistischen und praxisnahen Szenario.</w:t>
+      </w:r>
+    </w:p>
+    <w:p>
+      <w:pPr>
+        <w:pStyle w:val="berschrift1"/>
+      </w:pPr>
+      <w:bookmarkStart w:id="12" w:name="_Toc231907586"/>
+      <w:r>
+        <w:t>2</w:t>
+      </w:r>
+      <w:r>
+        <w:t>.1</w:t>
+      </w:r>
+      <w:r>
+        <w:t xml:space="preserve"> Mögliche Risiken</w:t>
+      </w:r>
+      <w:bookmarkEnd w:id="12"/>
+      <w:r>
+        <w:t xml:space="preserve"> </w:t>
+      </w:r>
+    </w:p>
+    <w:p>
+      <w:pPr>
+        <w:pStyle w:val="berschrift2"/>
+      </w:pPr>
+      <w:bookmarkStart w:id="13" w:name="_Toc231907587"/>
+      <w:r>
+        <w:t>2.2 Erfahrung in verschiedenen Bereichen</w:t>
+      </w:r>
+      <w:bookmarkEnd w:id="13"/>
+      <w:r>
+        <w:t xml:space="preserve"> </w:t>
+      </w:r>
+    </w:p>
+    <w:p>
+      <w:r>
+        <w:t>Da ich in einigen Bereichen nur wenig oder keine Erfahrung habe, kann es bei der Programmierung oder bei der Verknüpfung der verschiedenen Komponenten zu Schwierigkeiten kommen. Deshalb muss ich darauf achten, meine Fähigkeiten realistisch einzuschätzen und mich nicht zu überschätzen. Andernfalls könnte dies den Fortschritt des Projekts erheblich beeinträchtigen.</w:t>
+      </w:r>
+    </w:p>
+    <w:p>
+      <w:pPr>
+        <w:pStyle w:val="berschrift2"/>
+      </w:pPr>
+      <w:bookmarkStart w:id="14" w:name="_Toc231907588"/>
+      <w:r>
+        <w:t>2.3 Zeitdruck</w:t>
+      </w:r>
+      <w:bookmarkEnd w:id="14"/>
+      <w:r>
+        <w:t xml:space="preserve"> </w:t>
+      </w:r>
+    </w:p>
+    <w:p>
+      <w:r>
+        <w:t>Ein weiterer Risikofaktor ist die verfügbare Zeit. Es besteht die Möglichkeit, dass ich ein zu umfangreiches Projekt gewählt habe. Zusätzlich war ich vor dem Projektstart zwei Tage krank, wodurch ich bereits zu Beginn in Rückstand geraten bin. Dies ist besonders ungünstig, da ich ursprünglich ein Projekt mit einem höheren Umfang und mehr Funktionen umsetzen wollte.</w:t>
+      </w:r>
+    </w:p>
+    <w:p>
+      <w:pPr>
+        <w:pStyle w:val="berschrift2"/>
+      </w:pPr>
+      <w:bookmarkStart w:id="15" w:name="_Toc231907589"/>
+      <w:r>
+        <w:t>2.4 Grosse Datenmengen</w:t>
+      </w:r>
+      <w:bookmarkEnd w:id="15"/>
+      <w:r>
+        <w:t xml:space="preserve"> </w:t>
+      </w:r>
+    </w:p>
+    <w:p>
+      <w:r>
+        <w:t>Auch die grosse Datenmenge stellt eine Herausforderung dar. In der Formel 1 fallen sehr viele Daten an, die verarbeitet und dargestellt werden müssen. Dabei besteht die Gefahr, dass Datensätze unvollständig oder fehlerhaft sind. Zudem können grosse Datenmengen zu längeren Ladezeiten führen, was die Benutzerfreundlichkeit der Anwendung beeinträchtigen würde. Aus diesem Grund müssen geeignete Massnahmen getroffen werden, um die Daten effizient zu verarbeiten und eine gute Performance sicherzustellen.</w:t>
+      </w:r>
+    </w:p>
+    <w:p>
+      <w:pPr>
+        <w:pStyle w:val="berschrift1"/>
+      </w:pPr>
+      <w:bookmarkStart w:id="16" w:name="_Toc231907590"/>
+      <w:r>
+        <w:rPr>
+          <w:noProof/>
+        </w:rPr>
+        <w:lastRenderedPageBreak/>
+        <w:drawing>
+          <wp:anchor distT="0" distB="0" distL="114300" distR="114300" simplePos="0" relativeHeight="251669504" behindDoc="0" locked="0" layoutInCell="1" allowOverlap="1" wp14:anchorId="53049A61" wp14:editId="20EDA8B1">
+            <wp:simplePos x="0" y="0"/>
+            <wp:positionH relativeFrom="margin">
+              <wp:align>left</wp:align>
+            </wp:positionH>
+            <wp:positionV relativeFrom="paragraph">
+              <wp:posOffset>364490</wp:posOffset>
+            </wp:positionV>
+            <wp:extent cx="5427980" cy="2992120"/>
+            <wp:effectExtent l="0" t="0" r="1270" b="0"/>
+            <wp:wrapTopAndBottom/>
+            <wp:docPr id="360293907" name="Grafik 6" descr="Gantt-Diagramm zeigt Aufgabenplanung und Zeitverlauf eines Projekts über 10 Tage mit farbigen Balken für einzelne Aufgaben. Aufgaben sind nummeriert und benannt, Balkenpositionen markieren Start- und Endtage, wichtige Meilensteine und Abhängigkeiten erkennbar."/>
+            <wp:cNvGraphicFramePr>
+              <a:graphicFrameLocks xmlns:a="http://schemas.openxmlformats.org/drawingml/2006/main" noChangeAspect="1"/>
+            </wp:cNvGraphicFramePr>
+            <a:graphic xmlns:a="http://schemas.openxmlformats.org/drawingml/2006/main">
+              <a:graphicData uri="http://schemas.openxmlformats.org/drawingml/2006/picture">
+                <pic:pic xmlns:pic="http://schemas.openxmlformats.org/drawingml/2006/picture">
+                  <pic:nvPicPr>
+                    <pic:cNvPr id="360293907" name="Grafik 6" descr="Gantt-Diagramm zeigt Aufgabenplanung und Zeitverlauf eines Projekts über 10 Tage mit farbigen Balken für einzelne Aufgaben. Aufgaben sind nummeriert und benannt, Balkenpositionen markieren Start- und Endtage, wichtige Meilensteine und Abhängigkeiten erkennbar."/>
+                    <pic:cNvPicPr/>
+                  </pic:nvPicPr>
+                  <pic:blipFill>
+                    <a:blip r:embed="rId12" cstate="print">
+                      <a:extLst>
+                        <a:ext uri="{28A0092B-C50C-407E-A947-70E740481C1C}">
+                          <a14:useLocalDpi xmlns:a14="http://schemas.microsoft.com/office/drawing/2010/main" val="0"/>
+                        </a:ext>
+                      </a:extLst>
+                    </a:blip>
+                    <a:stretch>
+                      <a:fillRect/>
+                    </a:stretch>
+                  </pic:blipFill>
+                  <pic:spPr>
+                    <a:xfrm>
+                      <a:off x="0" y="0"/>
+                      <a:ext cx="5427980" cy="2992120"/>
+                    </a:xfrm>
+                    <a:prstGeom prst="rect">
+                      <a:avLst/>
+                    </a:prstGeom>
+                  </pic:spPr>
+                </pic:pic>
+              </a:graphicData>
+            </a:graphic>
+            <wp14:sizeRelH relativeFrom="margin">
+              <wp14:pctWidth>0</wp14:pctWidth>
+            </wp14:sizeRelH>
+            <wp14:sizeRelV relativeFrom="margin">
+              <wp14:pctHeight>0</wp14:pctHeight>
+            </wp14:sizeRelV>
+          </wp:anchor>
+        </w:drawing>
+      </w:r>
+      <w:r>
+        <w:t xml:space="preserve">3.1 </w:t>
+      </w:r>
+      <w:r>
+        <w:t>Planung</w:t>
+      </w:r>
+      <w:bookmarkEnd w:id="16"/>
+      <w:r>
+        <w:t xml:space="preserve"> </w:t>
+      </w:r>
+    </w:p>
+    <w:p>
+      <w:pPr>
+        <w:pStyle w:val="berschrift1"/>
+      </w:pPr>
+      <w:bookmarkStart w:id="17" w:name="_Toc231907591"/>
+      <w:r>
+        <w:t>4</w:t>
+      </w:r>
+      <w:r>
+        <w:t>.1</w:t>
+      </w:r>
+      <w:r>
+        <w:t>Entscheidung</w:t>
+      </w:r>
+      <w:bookmarkEnd w:id="17"/>
+      <w:r>
+        <w:t xml:space="preserve"> </w:t>
+      </w:r>
+    </w:p>
+    <w:p>
+      <w:pPr>
+        <w:pStyle w:val="berschrift2"/>
+      </w:pPr>
+      <w:bookmarkStart w:id="18" w:name="_Toc231907592"/>
+      <w:r>
+        <w:t>4</w:t>
+      </w:r>
+      <w:r>
+        <w:t xml:space="preserve">.2 </w:t>
+      </w:r>
+      <w:r>
+        <w:t>Expo oder PWA?</w:t>
+      </w:r>
+      <w:bookmarkEnd w:id="18"/>
+      <w:r>
+        <w:t xml:space="preserve"> </w:t>
+      </w:r>
+    </w:p>
+    <w:p>
+      <w:r>
+        <w:t>Bereits zu Beginn des Projekts musste ich mehrere wichtige Entscheidungen treffen. Eine der ersten Fragen war, auf welcher Plattform ich meine Anwendung entwickeln möchte. Anfangs plante ich, die App mit Expo zu erstellen, da ich mich bereits mit dieser Möglichkeit beschäftigt hatte. Nach genauerer Überlegung stellte sich jedoch heraus, dass dies für mein Projekt nicht die beste Lösung war. Durch ein Gespräch mit Reto wurde mir die Entwicklung als Progressive Web App (PWA) vorgeschlagen.</w:t>
+      </w:r>
+    </w:p>
+    <w:p>
+      <w:pPr>
+        <w:pStyle w:val="berschrift2"/>
+      </w:pPr>
+      <w:bookmarkStart w:id="19" w:name="_Toc231907593"/>
+      <w:r>
+        <w:t>4</w:t>
+      </w:r>
+      <w:r>
+        <w:t xml:space="preserve">.3 </w:t>
+      </w:r>
+      <w:r>
+        <w:t>Erklärung von PWA</w:t>
+      </w:r>
+      <w:bookmarkEnd w:id="19"/>
+      <w:r>
+        <w:t xml:space="preserve"> </w:t>
+      </w:r>
+    </w:p>
+    <w:p>
+      <w:r>
+        <w:t>Eine PWA bietet den Vorteil, dass die Anwendung als normale Webseite aufgerufen werden kann, sich aber gleichzeitig wie eine App verhält. Nutzer können die Webseite besuchen und diese anschliessend mit wenigen Klicks auf dem Startbildschirm ihres Smartphones oder Tablets installieren. Dadurch erhält die Anwendung ein appähnliches Erscheinungsbild, ohne dass sie über einen App Store veröffentlicht werden muss. Nach einer Analyse der Vor- und Nachteile entschied ich mich deshalb für die Umsetzung als PWA.</w:t>
+      </w:r>
+    </w:p>
+    <w:p>
+      <w:pPr>
+        <w:pStyle w:val="berschrift2"/>
+      </w:pPr>
+      <w:bookmarkStart w:id="20" w:name="_Toc231907594"/>
+      <w:r>
+        <w:t>4</w:t>
+      </w:r>
+      <w:r>
+        <w:t xml:space="preserve">.4 </w:t>
+      </w:r>
+      <w:r>
+        <w:t>Hosting der Webseite</w:t>
+      </w:r>
+      <w:bookmarkEnd w:id="20"/>
+      <w:r>
+        <w:t xml:space="preserve"> </w:t>
+      </w:r>
+    </w:p>
+    <w:p>
+      <w:r>
+        <w:t xml:space="preserve">Eine weitere wichtige Entscheidung betraf das Hosting der Anwendung. Zu Beginn wusste ich nicht, wo ich die Webseite veröffentlichen und dauerhaft bereitstellen könnte. Dabei war für mich besonders wichtig, eine Lösung zu finden, die keine zusätzlichen Kosten verursacht. Nach verschiedenen Überlegungen entschied ich mich für GitHub Pages. Diese Möglichkeit war mir bereits aus dem Basislehrjahr bekannt, da </w:t>
+      </w:r>
+      <w:r>
+        <w:lastRenderedPageBreak/>
+        <w:t>sie dort mehrfach erwähnt und eingesetzt wurde. GitHub Pages ermöglicht es, statische Webseiten kostenlos direkt aus einem GitHub-Repository zu veröffentlichen. Dadurch konnte ich die Anwendung einfach hosten und gleichzeitig von den Vorteilen der Versionsverwaltung mit GitHub profitieren.</w:t>
+      </w:r>
+    </w:p>
+    <w:p>
+      <w:pPr>
+        <w:pStyle w:val="berschrift2"/>
+      </w:pPr>
+      <w:bookmarkStart w:id="21" w:name="_Toc231907595"/>
+      <w:r>
+        <w:t>4</w:t>
+      </w:r>
+      <w:r>
+        <w:t xml:space="preserve">.5 </w:t>
+      </w:r>
+      <w:r>
+        <w:t>Entschluss meiner Entscheidungen</w:t>
+      </w:r>
+      <w:bookmarkEnd w:id="21"/>
+      <w:r>
+        <w:t xml:space="preserve"> </w:t>
+      </w:r>
+    </w:p>
+    <w:p>
+      <w:r>
+        <w:t>Die Wahl einer Progressive Web App in Kombination mit GitHub Pages erwies sich als eine passende Lösung für mein Projekt. Dadurch konnte ich die Anwendung kostenlos veröffentlichen und gleichzeitig eine benutzerfreundliche App-ähnliche Erfahrung für die Nutzer schaffen.</w:t>
+      </w:r>
+    </w:p>
     <w:p/>
-    <w:p>
-      <w:pPr>
-        <w:pStyle w:val="berschrift1"/>
-      </w:pPr>
-      <w:bookmarkStart w:id="0" w:name="_Toc231820046"/>
-      <w:r>
-        <w:t>Kapitel 1</w:t>
-      </w:r>
-      <w:bookmarkEnd w:id="0"/>
-      <w:r>
-        <w:t xml:space="preserve"> </w:t>
-      </w:r>
-    </w:p>
-    <w:p>
-      <w:pPr>
-        <w:pStyle w:val="berschrift2"/>
-      </w:pPr>
-      <w:bookmarkStart w:id="1" w:name="_Toc231820047"/>
-      <w:r>
-        <w:t>Kapitel 2</w:t>
-      </w:r>
-      <w:bookmarkEnd w:id="1"/>
-      <w:r>
-        <w:t xml:space="preserve"> </w:t>
-      </w:r>
-    </w:p>
-    <w:p>
-      <w:pPr>
-        <w:pStyle w:val="berschrift3"/>
-      </w:pPr>
-      <w:bookmarkStart w:id="2" w:name="_Toc231820048"/>
-      <w:r>
-        <w:t>Kapitel 3</w:t>
-      </w:r>
-      <w:bookmarkEnd w:id="2"/>
-      <w:r>
-        <w:t xml:space="preserve"> </w:t>
-      </w:r>
-    </w:p>
-    <w:p>
-      <w:pPr>
-        <w:pStyle w:val="berschrift4"/>
-      </w:pPr>
-      <w:r>
-        <w:t xml:space="preserve">Kapitel 4 </w:t>
-      </w:r>
-    </w:p>
-    <w:p>
-      <w:pPr>
-        <w:pStyle w:val="Untertitel"/>
-      </w:pPr>
-    </w:p>
     <w:sectPr>
-      <w:headerReference w:type="default" r:id="rId11"/>
-      <w:footerReference w:type="default" r:id="rId12"/>
-      <w:headerReference w:type="first" r:id="rId13"/>
-      <w:footerReference w:type="first" r:id="rId14"/>
+      <w:headerReference w:type="default" r:id="rId13"/>
+      <w:footerReference w:type="default" r:id="rId14"/>
+      <w:headerReference w:type="first" r:id="rId15"/>
+      <w:footerReference w:type="first" r:id="rId16"/>
       <w:pgSz w:w="11906" w:h="16838"/>
       <w:pgMar w:top="1417" w:right="1417" w:bottom="1134" w:left="1417" w:header="708" w:footer="708" w:gutter="0"/>
       <w:pgNumType w:start="0"/>
@@ -1190,13 +3687,20 @@
   <w:p>
     <w:pPr>
       <w:pStyle w:val="Kopfzeile"/>
+      <w:tabs>
+        <w:tab w:val="clear" w:pos="9072"/>
+        <w:tab w:val="left" w:pos="5628"/>
+      </w:tabs>
+      <w:rPr>
+        <w:lang w:val="fr-CH"/>
+      </w:rPr>
     </w:pPr>
     <w:r>
       <w:fldChar w:fldCharType="begin"/>
     </w:r>
     <w:r>
       <w:rPr>
-        <w:lang w:val="de-DE"/>
+        <w:lang w:val="fr-CH"/>
       </w:rPr>
       <w:instrText xml:space="preserve"> FILENAME \* MERGEFORMAT </w:instrText>
     </w:r>
@@ -1206,7 +3710,7 @@
     <w:r>
       <w:rPr>
         <w:noProof/>
-        <w:lang w:val="de-DE"/>
+        <w:lang w:val="fr-CH"/>
       </w:rPr>
       <w:t>Dokumentation_F1-app_durani.docx</w:t>
     </w:r>
@@ -1215,14 +3719,14 @@
     </w:r>
     <w:r>
       <w:rPr>
-        <w:lang w:val="de-DE"/>
+        <w:lang w:val="fr-CH"/>
       </w:rPr>
       <w:tab/>
     </w:r>
     <w:sdt>
       <w:sdtPr>
         <w:rPr>
-          <w:lang w:val="de-DE"/>
+          <w:lang w:val="fr-CH"/>
         </w:rPr>
         <w:alias w:val="Titel"/>
         <w:tag w:val=""/>
@@ -1236,12 +3740,31 @@
       <w:sdtContent>
         <w:r>
           <w:rPr>
-            <w:lang w:val="de-DE"/>
+            <w:lang w:val="fr-CH"/>
           </w:rPr>
           <w:t>F1-App</w:t>
         </w:r>
       </w:sdtContent>
     </w:sdt>
+    <w:r>
+      <w:rPr>
+        <w:lang w:val="fr-CH"/>
+      </w:rPr>
+      <w:tab/>
+      <w:t>vers</w:t>
+    </w:r>
+    <w:r>
+      <w:rPr>
+        <w:lang w:val="fr-CH"/>
+      </w:rPr>
+      <w:t>ion 1.</w:t>
+    </w:r>
+    <w:r>
+      <w:rPr>
+        <w:lang w:val="fr-CH"/>
+      </w:rPr>
+      <w:t>1</w:t>
+    </w:r>
   </w:p>
 </w:hdr>
 </file>
@@ -1278,15 +3801,946 @@
         <w:text/>
       </w:sdtPr>
       <w:sdtContent>
-        <w:proofErr w:type="spellStart"/>
         <w:r>
           <w:t>Ruag</w:t>
         </w:r>
-        <w:proofErr w:type="spellEnd"/>
       </w:sdtContent>
     </w:sdt>
   </w:p>
 </w:hdr>
+</file>
+
+<file path=word/numbering.xml><?xml version="1.0" encoding="utf-8"?>
+<w:numbering xmlns:wpc="http://schemas.microsoft.com/office/word/2010/wordprocessingCanvas" xmlns:cx="http://schemas.microsoft.com/office/drawing/2014/chartex" xmlns:cx1="http://schemas.microsoft.com/office/drawing/2015/9/8/chartex" xmlns:cx2="http://schemas.microsoft.com/office/drawing/2015/10/21/chartex" xmlns:cx3="http://schemas.microsoft.com/office/drawing/2016/5/9/chartex" xmlns:cx4="http://schemas.microsoft.com/office/drawing/2016/5/10/chartex" xmlns:cx5="http://schemas.microsoft.com/office/drawing/2016/5/11/chartex" xmlns:cx6="http://schemas.microsoft.com/office/drawing/2016/5/12/chartex" xmlns:cx7="http://schemas.microsoft.com/office/drawing/2016/5/13/chartex" xmlns:cx8="http://schemas.microsoft.com/office/drawing/2016/5/14/chartex" xmlns:mc="http://schemas.openxmlformats.org/markup-compatibility/2006" xmlns:aink="http://schemas.microsoft.com/office/drawing/2016/ink" xmlns:am3d="http://schemas.microsoft.com/office/drawing/2017/model3d" xmlns:o="urn:schemas-microsoft-com:office:office" xmlns:oel="http://schemas.microsoft.com/office/2019/extlst" xmlns:r="http://schemas.openxmlformats.org/officeDocument/2006/relationships" xmlns:m="http://schemas.openxmlformats.org/officeDocument/2006/math" xmlns:v="urn:schemas-microsoft-com:vml" xmlns:wp14="http://schemas.microsoft.com/office/word/2010/wordprocessingDrawing" xmlns:wp="http://schemas.openxmlformats.org/drawingml/2006/wordprocessingDrawing" xmlns:w10="urn:schemas-microsoft-com:office:word" xmlns:w="http://schemas.openxmlformats.org/wordprocessingml/2006/main" xmlns:w14="http://schemas.microsoft.com/office/word/2010/wordml" xmlns:w15="http://schemas.microsoft.com/office/word/2012/wordml" xmlns:w16cex="http://schemas.microsoft.com/office/word/2018/wordml/cex" xmlns:w16cid="http://schemas.microsoft.com/office/word/2016/wordml/cid" xmlns:w16="http://schemas.microsoft.com/office/word/2018/wordml" xmlns:w16du="http://schemas.microsoft.com/office/word/2023/wordml/word16du" xmlns:w16sdtdh="http://schemas.microsoft.com/office/word/2020/wordml/sdtdatahash" xmlns:w16sdtfl="http://schemas.microsoft.com/office/word/2024/wordml/sdtformatlock" xmlns:w16se="http://schemas.microsoft.com/office/word/2015/wordml/symex" xmlns:wpg="http://schemas.microsoft.com/office/word/2010/wordprocessingGroup" xmlns:wpi="http://schemas.microsoft.com/office/word/2010/wordprocessingInk" xmlns:wne="http://schemas.microsoft.com/office/word/2006/wordml" xmlns:wps="http://schemas.microsoft.com/office/word/2010/wordprocessingShape" mc:Ignorable="w14 w15 w16se w16cid w16 w16cex w16sdtdh w16sdtfl w16du wp14">
+  <w:abstractNum w:abstractNumId="0" w15:restartNumberingAfterBreak="0">
+    <w:nsid w:val="018D327B"/>
+    <w:multiLevelType w:val="hybridMultilevel"/>
+    <w:tmpl w:val="A20AFEC6"/>
+    <w:lvl w:ilvl="0" w:tplc="08070001">
+      <w:start w:val="1"/>
+      <w:numFmt w:val="bullet"/>
+      <w:lvlText w:val=""/>
+      <w:lvlJc w:val="left"/>
+      <w:pPr>
+        <w:ind w:left="1080" w:hanging="360"/>
+      </w:pPr>
+      <w:rPr>
+        <w:rFonts w:ascii="Symbol" w:hAnsi="Symbol" w:hint="default"/>
+      </w:rPr>
+    </w:lvl>
+    <w:lvl w:ilvl="1" w:tplc="08070003" w:tentative="1">
+      <w:start w:val="1"/>
+      <w:numFmt w:val="bullet"/>
+      <w:lvlText w:val="o"/>
+      <w:lvlJc w:val="left"/>
+      <w:pPr>
+        <w:ind w:left="1800" w:hanging="360"/>
+      </w:pPr>
+      <w:rPr>
+        <w:rFonts w:ascii="Courier New" w:hAnsi="Courier New" w:cs="Courier New" w:hint="default"/>
+      </w:rPr>
+    </w:lvl>
+    <w:lvl w:ilvl="2" w:tplc="08070005" w:tentative="1">
+      <w:start w:val="1"/>
+      <w:numFmt w:val="bullet"/>
+      <w:lvlText w:val=""/>
+      <w:lvlJc w:val="left"/>
+      <w:pPr>
+        <w:ind w:left="2520" w:hanging="360"/>
+      </w:pPr>
+      <w:rPr>
+        <w:rFonts w:ascii="Wingdings" w:hAnsi="Wingdings" w:hint="default"/>
+      </w:rPr>
+    </w:lvl>
+    <w:lvl w:ilvl="3" w:tplc="08070001" w:tentative="1">
+      <w:start w:val="1"/>
+      <w:numFmt w:val="bullet"/>
+      <w:lvlText w:val=""/>
+      <w:lvlJc w:val="left"/>
+      <w:pPr>
+        <w:ind w:left="3240" w:hanging="360"/>
+      </w:pPr>
+      <w:rPr>
+        <w:rFonts w:ascii="Symbol" w:hAnsi="Symbol" w:hint="default"/>
+      </w:rPr>
+    </w:lvl>
+    <w:lvl w:ilvl="4" w:tplc="08070003" w:tentative="1">
+      <w:start w:val="1"/>
+      <w:numFmt w:val="bullet"/>
+      <w:lvlText w:val="o"/>
+      <w:lvlJc w:val="left"/>
+      <w:pPr>
+        <w:ind w:left="3960" w:hanging="360"/>
+      </w:pPr>
+      <w:rPr>
+        <w:rFonts w:ascii="Courier New" w:hAnsi="Courier New" w:cs="Courier New" w:hint="default"/>
+      </w:rPr>
+    </w:lvl>
+    <w:lvl w:ilvl="5" w:tplc="08070005" w:tentative="1">
+      <w:start w:val="1"/>
+      <w:numFmt w:val="bullet"/>
+      <w:lvlText w:val=""/>
+      <w:lvlJc w:val="left"/>
+      <w:pPr>
+        <w:ind w:left="4680" w:hanging="360"/>
+      </w:pPr>
+      <w:rPr>
+        <w:rFonts w:ascii="Wingdings" w:hAnsi="Wingdings" w:hint="default"/>
+      </w:rPr>
+    </w:lvl>
+    <w:lvl w:ilvl="6" w:tplc="08070001" w:tentative="1">
+      <w:start w:val="1"/>
+      <w:numFmt w:val="bullet"/>
+      <w:lvlText w:val=""/>
+      <w:lvlJc w:val="left"/>
+      <w:pPr>
+        <w:ind w:left="5400" w:hanging="360"/>
+      </w:pPr>
+      <w:rPr>
+        <w:rFonts w:ascii="Symbol" w:hAnsi="Symbol" w:hint="default"/>
+      </w:rPr>
+    </w:lvl>
+    <w:lvl w:ilvl="7" w:tplc="08070003" w:tentative="1">
+      <w:start w:val="1"/>
+      <w:numFmt w:val="bullet"/>
+      <w:lvlText w:val="o"/>
+      <w:lvlJc w:val="left"/>
+      <w:pPr>
+        <w:ind w:left="6120" w:hanging="360"/>
+      </w:pPr>
+      <w:rPr>
+        <w:rFonts w:ascii="Courier New" w:hAnsi="Courier New" w:cs="Courier New" w:hint="default"/>
+      </w:rPr>
+    </w:lvl>
+    <w:lvl w:ilvl="8" w:tplc="08070005" w:tentative="1">
+      <w:start w:val="1"/>
+      <w:numFmt w:val="bullet"/>
+      <w:lvlText w:val=""/>
+      <w:lvlJc w:val="left"/>
+      <w:pPr>
+        <w:ind w:left="6840" w:hanging="360"/>
+      </w:pPr>
+      <w:rPr>
+        <w:rFonts w:ascii="Wingdings" w:hAnsi="Wingdings" w:hint="default"/>
+      </w:rPr>
+    </w:lvl>
+  </w:abstractNum>
+  <w:abstractNum w:abstractNumId="1" w15:restartNumberingAfterBreak="0">
+    <w:nsid w:val="286148BD"/>
+    <w:multiLevelType w:val="hybridMultilevel"/>
+    <w:tmpl w:val="A18CE9EC"/>
+    <w:lvl w:ilvl="0" w:tplc="08070001">
+      <w:start w:val="1"/>
+      <w:numFmt w:val="bullet"/>
+      <w:lvlText w:val=""/>
+      <w:lvlJc w:val="left"/>
+      <w:pPr>
+        <w:ind w:left="1080" w:hanging="360"/>
+      </w:pPr>
+      <w:rPr>
+        <w:rFonts w:ascii="Symbol" w:hAnsi="Symbol" w:hint="default"/>
+      </w:rPr>
+    </w:lvl>
+    <w:lvl w:ilvl="1" w:tplc="08070003" w:tentative="1">
+      <w:start w:val="1"/>
+      <w:numFmt w:val="bullet"/>
+      <w:lvlText w:val="o"/>
+      <w:lvlJc w:val="left"/>
+      <w:pPr>
+        <w:ind w:left="1800" w:hanging="360"/>
+      </w:pPr>
+      <w:rPr>
+        <w:rFonts w:ascii="Courier New" w:hAnsi="Courier New" w:cs="Courier New" w:hint="default"/>
+      </w:rPr>
+    </w:lvl>
+    <w:lvl w:ilvl="2" w:tplc="08070005" w:tentative="1">
+      <w:start w:val="1"/>
+      <w:numFmt w:val="bullet"/>
+      <w:lvlText w:val=""/>
+      <w:lvlJc w:val="left"/>
+      <w:pPr>
+        <w:ind w:left="2520" w:hanging="360"/>
+      </w:pPr>
+      <w:rPr>
+        <w:rFonts w:ascii="Wingdings" w:hAnsi="Wingdings" w:hint="default"/>
+      </w:rPr>
+    </w:lvl>
+    <w:lvl w:ilvl="3" w:tplc="08070001" w:tentative="1">
+      <w:start w:val="1"/>
+      <w:numFmt w:val="bullet"/>
+      <w:lvlText w:val=""/>
+      <w:lvlJc w:val="left"/>
+      <w:pPr>
+        <w:ind w:left="3240" w:hanging="360"/>
+      </w:pPr>
+      <w:rPr>
+        <w:rFonts w:ascii="Symbol" w:hAnsi="Symbol" w:hint="default"/>
+      </w:rPr>
+    </w:lvl>
+    <w:lvl w:ilvl="4" w:tplc="08070003" w:tentative="1">
+      <w:start w:val="1"/>
+      <w:numFmt w:val="bullet"/>
+      <w:lvlText w:val="o"/>
+      <w:lvlJc w:val="left"/>
+      <w:pPr>
+        <w:ind w:left="3960" w:hanging="360"/>
+      </w:pPr>
+      <w:rPr>
+        <w:rFonts w:ascii="Courier New" w:hAnsi="Courier New" w:cs="Courier New" w:hint="default"/>
+      </w:rPr>
+    </w:lvl>
+    <w:lvl w:ilvl="5" w:tplc="08070005" w:tentative="1">
+      <w:start w:val="1"/>
+      <w:numFmt w:val="bullet"/>
+      <w:lvlText w:val=""/>
+      <w:lvlJc w:val="left"/>
+      <w:pPr>
+        <w:ind w:left="4680" w:hanging="360"/>
+      </w:pPr>
+      <w:rPr>
+        <w:rFonts w:ascii="Wingdings" w:hAnsi="Wingdings" w:hint="default"/>
+      </w:rPr>
+    </w:lvl>
+    <w:lvl w:ilvl="6" w:tplc="08070001" w:tentative="1">
+      <w:start w:val="1"/>
+      <w:numFmt w:val="bullet"/>
+      <w:lvlText w:val=""/>
+      <w:lvlJc w:val="left"/>
+      <w:pPr>
+        <w:ind w:left="5400" w:hanging="360"/>
+      </w:pPr>
+      <w:rPr>
+        <w:rFonts w:ascii="Symbol" w:hAnsi="Symbol" w:hint="default"/>
+      </w:rPr>
+    </w:lvl>
+    <w:lvl w:ilvl="7" w:tplc="08070003" w:tentative="1">
+      <w:start w:val="1"/>
+      <w:numFmt w:val="bullet"/>
+      <w:lvlText w:val="o"/>
+      <w:lvlJc w:val="left"/>
+      <w:pPr>
+        <w:ind w:left="6120" w:hanging="360"/>
+      </w:pPr>
+      <w:rPr>
+        <w:rFonts w:ascii="Courier New" w:hAnsi="Courier New" w:cs="Courier New" w:hint="default"/>
+      </w:rPr>
+    </w:lvl>
+    <w:lvl w:ilvl="8" w:tplc="08070005" w:tentative="1">
+      <w:start w:val="1"/>
+      <w:numFmt w:val="bullet"/>
+      <w:lvlText w:val=""/>
+      <w:lvlJc w:val="left"/>
+      <w:pPr>
+        <w:ind w:left="6840" w:hanging="360"/>
+      </w:pPr>
+      <w:rPr>
+        <w:rFonts w:ascii="Wingdings" w:hAnsi="Wingdings" w:hint="default"/>
+      </w:rPr>
+    </w:lvl>
+  </w:abstractNum>
+  <w:abstractNum w:abstractNumId="2" w15:restartNumberingAfterBreak="0">
+    <w:nsid w:val="300C7341"/>
+    <w:multiLevelType w:val="hybridMultilevel"/>
+    <w:tmpl w:val="BB380A6C"/>
+    <w:lvl w:ilvl="0" w:tplc="08070001">
+      <w:start w:val="1"/>
+      <w:numFmt w:val="bullet"/>
+      <w:lvlText w:val=""/>
+      <w:lvlJc w:val="left"/>
+      <w:pPr>
+        <w:ind w:left="1080" w:hanging="360"/>
+      </w:pPr>
+      <w:rPr>
+        <w:rFonts w:ascii="Symbol" w:hAnsi="Symbol" w:hint="default"/>
+      </w:rPr>
+    </w:lvl>
+    <w:lvl w:ilvl="1" w:tplc="08070003" w:tentative="1">
+      <w:start w:val="1"/>
+      <w:numFmt w:val="bullet"/>
+      <w:lvlText w:val="o"/>
+      <w:lvlJc w:val="left"/>
+      <w:pPr>
+        <w:ind w:left="1800" w:hanging="360"/>
+      </w:pPr>
+      <w:rPr>
+        <w:rFonts w:ascii="Courier New" w:hAnsi="Courier New" w:cs="Courier New" w:hint="default"/>
+      </w:rPr>
+    </w:lvl>
+    <w:lvl w:ilvl="2" w:tplc="08070005" w:tentative="1">
+      <w:start w:val="1"/>
+      <w:numFmt w:val="bullet"/>
+      <w:lvlText w:val=""/>
+      <w:lvlJc w:val="left"/>
+      <w:pPr>
+        <w:ind w:left="2520" w:hanging="360"/>
+      </w:pPr>
+      <w:rPr>
+        <w:rFonts w:ascii="Wingdings" w:hAnsi="Wingdings" w:hint="default"/>
+      </w:rPr>
+    </w:lvl>
+    <w:lvl w:ilvl="3" w:tplc="08070001" w:tentative="1">
+      <w:start w:val="1"/>
+      <w:numFmt w:val="bullet"/>
+      <w:lvlText w:val=""/>
+      <w:lvlJc w:val="left"/>
+      <w:pPr>
+        <w:ind w:left="3240" w:hanging="360"/>
+      </w:pPr>
+      <w:rPr>
+        <w:rFonts w:ascii="Symbol" w:hAnsi="Symbol" w:hint="default"/>
+      </w:rPr>
+    </w:lvl>
+    <w:lvl w:ilvl="4" w:tplc="08070003" w:tentative="1">
+      <w:start w:val="1"/>
+      <w:numFmt w:val="bullet"/>
+      <w:lvlText w:val="o"/>
+      <w:lvlJc w:val="left"/>
+      <w:pPr>
+        <w:ind w:left="3960" w:hanging="360"/>
+      </w:pPr>
+      <w:rPr>
+        <w:rFonts w:ascii="Courier New" w:hAnsi="Courier New" w:cs="Courier New" w:hint="default"/>
+      </w:rPr>
+    </w:lvl>
+    <w:lvl w:ilvl="5" w:tplc="08070005" w:tentative="1">
+      <w:start w:val="1"/>
+      <w:numFmt w:val="bullet"/>
+      <w:lvlText w:val=""/>
+      <w:lvlJc w:val="left"/>
+      <w:pPr>
+        <w:ind w:left="4680" w:hanging="360"/>
+      </w:pPr>
+      <w:rPr>
+        <w:rFonts w:ascii="Wingdings" w:hAnsi="Wingdings" w:hint="default"/>
+      </w:rPr>
+    </w:lvl>
+    <w:lvl w:ilvl="6" w:tplc="08070001" w:tentative="1">
+      <w:start w:val="1"/>
+      <w:numFmt w:val="bullet"/>
+      <w:lvlText w:val=""/>
+      <w:lvlJc w:val="left"/>
+      <w:pPr>
+        <w:ind w:left="5400" w:hanging="360"/>
+      </w:pPr>
+      <w:rPr>
+        <w:rFonts w:ascii="Symbol" w:hAnsi="Symbol" w:hint="default"/>
+      </w:rPr>
+    </w:lvl>
+    <w:lvl w:ilvl="7" w:tplc="08070003" w:tentative="1">
+      <w:start w:val="1"/>
+      <w:numFmt w:val="bullet"/>
+      <w:lvlText w:val="o"/>
+      <w:lvlJc w:val="left"/>
+      <w:pPr>
+        <w:ind w:left="6120" w:hanging="360"/>
+      </w:pPr>
+      <w:rPr>
+        <w:rFonts w:ascii="Courier New" w:hAnsi="Courier New" w:cs="Courier New" w:hint="default"/>
+      </w:rPr>
+    </w:lvl>
+    <w:lvl w:ilvl="8" w:tplc="08070005" w:tentative="1">
+      <w:start w:val="1"/>
+      <w:numFmt w:val="bullet"/>
+      <w:lvlText w:val=""/>
+      <w:lvlJc w:val="left"/>
+      <w:pPr>
+        <w:ind w:left="6840" w:hanging="360"/>
+      </w:pPr>
+      <w:rPr>
+        <w:rFonts w:ascii="Wingdings" w:hAnsi="Wingdings" w:hint="default"/>
+      </w:rPr>
+    </w:lvl>
+  </w:abstractNum>
+  <w:abstractNum w:abstractNumId="3" w15:restartNumberingAfterBreak="0">
+    <w:nsid w:val="4BA82D3F"/>
+    <w:multiLevelType w:val="hybridMultilevel"/>
+    <w:tmpl w:val="045A6F88"/>
+    <w:lvl w:ilvl="0" w:tplc="08070001">
+      <w:start w:val="1"/>
+      <w:numFmt w:val="bullet"/>
+      <w:lvlText w:val=""/>
+      <w:lvlJc w:val="left"/>
+      <w:pPr>
+        <w:ind w:left="1080" w:hanging="360"/>
+      </w:pPr>
+      <w:rPr>
+        <w:rFonts w:ascii="Symbol" w:hAnsi="Symbol" w:hint="default"/>
+      </w:rPr>
+    </w:lvl>
+    <w:lvl w:ilvl="1" w:tplc="08070003" w:tentative="1">
+      <w:start w:val="1"/>
+      <w:numFmt w:val="bullet"/>
+      <w:lvlText w:val="o"/>
+      <w:lvlJc w:val="left"/>
+      <w:pPr>
+        <w:ind w:left="1800" w:hanging="360"/>
+      </w:pPr>
+      <w:rPr>
+        <w:rFonts w:ascii="Courier New" w:hAnsi="Courier New" w:cs="Courier New" w:hint="default"/>
+      </w:rPr>
+    </w:lvl>
+    <w:lvl w:ilvl="2" w:tplc="08070005" w:tentative="1">
+      <w:start w:val="1"/>
+      <w:numFmt w:val="bullet"/>
+      <w:lvlText w:val=""/>
+      <w:lvlJc w:val="left"/>
+      <w:pPr>
+        <w:ind w:left="2520" w:hanging="360"/>
+      </w:pPr>
+      <w:rPr>
+        <w:rFonts w:ascii="Wingdings" w:hAnsi="Wingdings" w:hint="default"/>
+      </w:rPr>
+    </w:lvl>
+    <w:lvl w:ilvl="3" w:tplc="08070001" w:tentative="1">
+      <w:start w:val="1"/>
+      <w:numFmt w:val="bullet"/>
+      <w:lvlText w:val=""/>
+      <w:lvlJc w:val="left"/>
+      <w:pPr>
+        <w:ind w:left="3240" w:hanging="360"/>
+      </w:pPr>
+      <w:rPr>
+        <w:rFonts w:ascii="Symbol" w:hAnsi="Symbol" w:hint="default"/>
+      </w:rPr>
+    </w:lvl>
+    <w:lvl w:ilvl="4" w:tplc="08070003" w:tentative="1">
+      <w:start w:val="1"/>
+      <w:numFmt w:val="bullet"/>
+      <w:lvlText w:val="o"/>
+      <w:lvlJc w:val="left"/>
+      <w:pPr>
+        <w:ind w:left="3960" w:hanging="360"/>
+      </w:pPr>
+      <w:rPr>
+        <w:rFonts w:ascii="Courier New" w:hAnsi="Courier New" w:cs="Courier New" w:hint="default"/>
+      </w:rPr>
+    </w:lvl>
+    <w:lvl w:ilvl="5" w:tplc="08070005" w:tentative="1">
+      <w:start w:val="1"/>
+      <w:numFmt w:val="bullet"/>
+      <w:lvlText w:val=""/>
+      <w:lvlJc w:val="left"/>
+      <w:pPr>
+        <w:ind w:left="4680" w:hanging="360"/>
+      </w:pPr>
+      <w:rPr>
+        <w:rFonts w:ascii="Wingdings" w:hAnsi="Wingdings" w:hint="default"/>
+      </w:rPr>
+    </w:lvl>
+    <w:lvl w:ilvl="6" w:tplc="08070001" w:tentative="1">
+      <w:start w:val="1"/>
+      <w:numFmt w:val="bullet"/>
+      <w:lvlText w:val=""/>
+      <w:lvlJc w:val="left"/>
+      <w:pPr>
+        <w:ind w:left="5400" w:hanging="360"/>
+      </w:pPr>
+      <w:rPr>
+        <w:rFonts w:ascii="Symbol" w:hAnsi="Symbol" w:hint="default"/>
+      </w:rPr>
+    </w:lvl>
+    <w:lvl w:ilvl="7" w:tplc="08070003" w:tentative="1">
+      <w:start w:val="1"/>
+      <w:numFmt w:val="bullet"/>
+      <w:lvlText w:val="o"/>
+      <w:lvlJc w:val="left"/>
+      <w:pPr>
+        <w:ind w:left="6120" w:hanging="360"/>
+      </w:pPr>
+      <w:rPr>
+        <w:rFonts w:ascii="Courier New" w:hAnsi="Courier New" w:cs="Courier New" w:hint="default"/>
+      </w:rPr>
+    </w:lvl>
+    <w:lvl w:ilvl="8" w:tplc="08070005" w:tentative="1">
+      <w:start w:val="1"/>
+      <w:numFmt w:val="bullet"/>
+      <w:lvlText w:val=""/>
+      <w:lvlJc w:val="left"/>
+      <w:pPr>
+        <w:ind w:left="6840" w:hanging="360"/>
+      </w:pPr>
+      <w:rPr>
+        <w:rFonts w:ascii="Wingdings" w:hAnsi="Wingdings" w:hint="default"/>
+      </w:rPr>
+    </w:lvl>
+  </w:abstractNum>
+  <w:abstractNum w:abstractNumId="4" w15:restartNumberingAfterBreak="0">
+    <w:nsid w:val="52F37D9E"/>
+    <w:multiLevelType w:val="hybridMultilevel"/>
+    <w:tmpl w:val="E982B94E"/>
+    <w:lvl w:ilvl="0" w:tplc="08070001">
+      <w:start w:val="1"/>
+      <w:numFmt w:val="bullet"/>
+      <w:lvlText w:val=""/>
+      <w:lvlJc w:val="left"/>
+      <w:pPr>
+        <w:ind w:left="1080" w:hanging="360"/>
+      </w:pPr>
+      <w:rPr>
+        <w:rFonts w:ascii="Symbol" w:hAnsi="Symbol" w:hint="default"/>
+      </w:rPr>
+    </w:lvl>
+    <w:lvl w:ilvl="1" w:tplc="08070003" w:tentative="1">
+      <w:start w:val="1"/>
+      <w:numFmt w:val="bullet"/>
+      <w:lvlText w:val="o"/>
+      <w:lvlJc w:val="left"/>
+      <w:pPr>
+        <w:ind w:left="1800" w:hanging="360"/>
+      </w:pPr>
+      <w:rPr>
+        <w:rFonts w:ascii="Courier New" w:hAnsi="Courier New" w:cs="Courier New" w:hint="default"/>
+      </w:rPr>
+    </w:lvl>
+    <w:lvl w:ilvl="2" w:tplc="08070005" w:tentative="1">
+      <w:start w:val="1"/>
+      <w:numFmt w:val="bullet"/>
+      <w:lvlText w:val=""/>
+      <w:lvlJc w:val="left"/>
+      <w:pPr>
+        <w:ind w:left="2520" w:hanging="360"/>
+      </w:pPr>
+      <w:rPr>
+        <w:rFonts w:ascii="Wingdings" w:hAnsi="Wingdings" w:hint="default"/>
+      </w:rPr>
+    </w:lvl>
+    <w:lvl w:ilvl="3" w:tplc="08070001" w:tentative="1">
+      <w:start w:val="1"/>
+      <w:numFmt w:val="bullet"/>
+      <w:lvlText w:val=""/>
+      <w:lvlJc w:val="left"/>
+      <w:pPr>
+        <w:ind w:left="3240" w:hanging="360"/>
+      </w:pPr>
+      <w:rPr>
+        <w:rFonts w:ascii="Symbol" w:hAnsi="Symbol" w:hint="default"/>
+      </w:rPr>
+    </w:lvl>
+    <w:lvl w:ilvl="4" w:tplc="08070003" w:tentative="1">
+      <w:start w:val="1"/>
+      <w:numFmt w:val="bullet"/>
+      <w:lvlText w:val="o"/>
+      <w:lvlJc w:val="left"/>
+      <w:pPr>
+        <w:ind w:left="3960" w:hanging="360"/>
+      </w:pPr>
+      <w:rPr>
+        <w:rFonts w:ascii="Courier New" w:hAnsi="Courier New" w:cs="Courier New" w:hint="default"/>
+      </w:rPr>
+    </w:lvl>
+    <w:lvl w:ilvl="5" w:tplc="08070005" w:tentative="1">
+      <w:start w:val="1"/>
+      <w:numFmt w:val="bullet"/>
+      <w:lvlText w:val=""/>
+      <w:lvlJc w:val="left"/>
+      <w:pPr>
+        <w:ind w:left="4680" w:hanging="360"/>
+      </w:pPr>
+      <w:rPr>
+        <w:rFonts w:ascii="Wingdings" w:hAnsi="Wingdings" w:hint="default"/>
+      </w:rPr>
+    </w:lvl>
+    <w:lvl w:ilvl="6" w:tplc="08070001" w:tentative="1">
+      <w:start w:val="1"/>
+      <w:numFmt w:val="bullet"/>
+      <w:lvlText w:val=""/>
+      <w:lvlJc w:val="left"/>
+      <w:pPr>
+        <w:ind w:left="5400" w:hanging="360"/>
+      </w:pPr>
+      <w:rPr>
+        <w:rFonts w:ascii="Symbol" w:hAnsi="Symbol" w:hint="default"/>
+      </w:rPr>
+    </w:lvl>
+    <w:lvl w:ilvl="7" w:tplc="08070003" w:tentative="1">
+      <w:start w:val="1"/>
+      <w:numFmt w:val="bullet"/>
+      <w:lvlText w:val="o"/>
+      <w:lvlJc w:val="left"/>
+      <w:pPr>
+        <w:ind w:left="6120" w:hanging="360"/>
+      </w:pPr>
+      <w:rPr>
+        <w:rFonts w:ascii="Courier New" w:hAnsi="Courier New" w:cs="Courier New" w:hint="default"/>
+      </w:rPr>
+    </w:lvl>
+    <w:lvl w:ilvl="8" w:tplc="08070005" w:tentative="1">
+      <w:start w:val="1"/>
+      <w:numFmt w:val="bullet"/>
+      <w:lvlText w:val=""/>
+      <w:lvlJc w:val="left"/>
+      <w:pPr>
+        <w:ind w:left="6840" w:hanging="360"/>
+      </w:pPr>
+      <w:rPr>
+        <w:rFonts w:ascii="Wingdings" w:hAnsi="Wingdings" w:hint="default"/>
+      </w:rPr>
+    </w:lvl>
+  </w:abstractNum>
+  <w:abstractNum w:abstractNumId="5" w15:restartNumberingAfterBreak="0">
+    <w:nsid w:val="5359571F"/>
+    <w:multiLevelType w:val="hybridMultilevel"/>
+    <w:tmpl w:val="6236281E"/>
+    <w:lvl w:ilvl="0" w:tplc="08070001">
+      <w:start w:val="1"/>
+      <w:numFmt w:val="bullet"/>
+      <w:lvlText w:val=""/>
+      <w:lvlJc w:val="left"/>
+      <w:pPr>
+        <w:ind w:left="1080" w:hanging="360"/>
+      </w:pPr>
+      <w:rPr>
+        <w:rFonts w:ascii="Symbol" w:hAnsi="Symbol" w:hint="default"/>
+      </w:rPr>
+    </w:lvl>
+    <w:lvl w:ilvl="1" w:tplc="08070003" w:tentative="1">
+      <w:start w:val="1"/>
+      <w:numFmt w:val="bullet"/>
+      <w:lvlText w:val="o"/>
+      <w:lvlJc w:val="left"/>
+      <w:pPr>
+        <w:ind w:left="1800" w:hanging="360"/>
+      </w:pPr>
+      <w:rPr>
+        <w:rFonts w:ascii="Courier New" w:hAnsi="Courier New" w:cs="Courier New" w:hint="default"/>
+      </w:rPr>
+    </w:lvl>
+    <w:lvl w:ilvl="2" w:tplc="08070005" w:tentative="1">
+      <w:start w:val="1"/>
+      <w:numFmt w:val="bullet"/>
+      <w:lvlText w:val=""/>
+      <w:lvlJc w:val="left"/>
+      <w:pPr>
+        <w:ind w:left="2520" w:hanging="360"/>
+      </w:pPr>
+      <w:rPr>
+        <w:rFonts w:ascii="Wingdings" w:hAnsi="Wingdings" w:hint="default"/>
+      </w:rPr>
+    </w:lvl>
+    <w:lvl w:ilvl="3" w:tplc="08070001" w:tentative="1">
+      <w:start w:val="1"/>
+      <w:numFmt w:val="bullet"/>
+      <w:lvlText w:val=""/>
+      <w:lvlJc w:val="left"/>
+      <w:pPr>
+        <w:ind w:left="3240" w:hanging="360"/>
+      </w:pPr>
+      <w:rPr>
+        <w:rFonts w:ascii="Symbol" w:hAnsi="Symbol" w:hint="default"/>
+      </w:rPr>
+    </w:lvl>
+    <w:lvl w:ilvl="4" w:tplc="08070003" w:tentative="1">
+      <w:start w:val="1"/>
+      <w:numFmt w:val="bullet"/>
+      <w:lvlText w:val="o"/>
+      <w:lvlJc w:val="left"/>
+      <w:pPr>
+        <w:ind w:left="3960" w:hanging="360"/>
+      </w:pPr>
+      <w:rPr>
+        <w:rFonts w:ascii="Courier New" w:hAnsi="Courier New" w:cs="Courier New" w:hint="default"/>
+      </w:rPr>
+    </w:lvl>
+    <w:lvl w:ilvl="5" w:tplc="08070005" w:tentative="1">
+      <w:start w:val="1"/>
+      <w:numFmt w:val="bullet"/>
+      <w:lvlText w:val=""/>
+      <w:lvlJc w:val="left"/>
+      <w:pPr>
+        <w:ind w:left="4680" w:hanging="360"/>
+      </w:pPr>
+      <w:rPr>
+        <w:rFonts w:ascii="Wingdings" w:hAnsi="Wingdings" w:hint="default"/>
+      </w:rPr>
+    </w:lvl>
+    <w:lvl w:ilvl="6" w:tplc="08070001" w:tentative="1">
+      <w:start w:val="1"/>
+      <w:numFmt w:val="bullet"/>
+      <w:lvlText w:val=""/>
+      <w:lvlJc w:val="left"/>
+      <w:pPr>
+        <w:ind w:left="5400" w:hanging="360"/>
+      </w:pPr>
+      <w:rPr>
+        <w:rFonts w:ascii="Symbol" w:hAnsi="Symbol" w:hint="default"/>
+      </w:rPr>
+    </w:lvl>
+    <w:lvl w:ilvl="7" w:tplc="08070003" w:tentative="1">
+      <w:start w:val="1"/>
+      <w:numFmt w:val="bullet"/>
+      <w:lvlText w:val="o"/>
+      <w:lvlJc w:val="left"/>
+      <w:pPr>
+        <w:ind w:left="6120" w:hanging="360"/>
+      </w:pPr>
+      <w:rPr>
+        <w:rFonts w:ascii="Courier New" w:hAnsi="Courier New" w:cs="Courier New" w:hint="default"/>
+      </w:rPr>
+    </w:lvl>
+    <w:lvl w:ilvl="8" w:tplc="08070005" w:tentative="1">
+      <w:start w:val="1"/>
+      <w:numFmt w:val="bullet"/>
+      <w:lvlText w:val=""/>
+      <w:lvlJc w:val="left"/>
+      <w:pPr>
+        <w:ind w:left="6840" w:hanging="360"/>
+      </w:pPr>
+      <w:rPr>
+        <w:rFonts w:ascii="Wingdings" w:hAnsi="Wingdings" w:hint="default"/>
+      </w:rPr>
+    </w:lvl>
+  </w:abstractNum>
+  <w:abstractNum w:abstractNumId="6" w15:restartNumberingAfterBreak="0">
+    <w:nsid w:val="55211DBE"/>
+    <w:multiLevelType w:val="hybridMultilevel"/>
+    <w:tmpl w:val="9844CFF6"/>
+    <w:lvl w:ilvl="0" w:tplc="08070001">
+      <w:start w:val="1"/>
+      <w:numFmt w:val="bullet"/>
+      <w:lvlText w:val=""/>
+      <w:lvlJc w:val="left"/>
+      <w:pPr>
+        <w:ind w:left="1080" w:hanging="360"/>
+      </w:pPr>
+      <w:rPr>
+        <w:rFonts w:ascii="Symbol" w:hAnsi="Symbol" w:hint="default"/>
+      </w:rPr>
+    </w:lvl>
+    <w:lvl w:ilvl="1" w:tplc="08070003" w:tentative="1">
+      <w:start w:val="1"/>
+      <w:numFmt w:val="bullet"/>
+      <w:lvlText w:val="o"/>
+      <w:lvlJc w:val="left"/>
+      <w:pPr>
+        <w:ind w:left="1800" w:hanging="360"/>
+      </w:pPr>
+      <w:rPr>
+        <w:rFonts w:ascii="Courier New" w:hAnsi="Courier New" w:cs="Courier New" w:hint="default"/>
+      </w:rPr>
+    </w:lvl>
+    <w:lvl w:ilvl="2" w:tplc="08070005" w:tentative="1">
+      <w:start w:val="1"/>
+      <w:numFmt w:val="bullet"/>
+      <w:lvlText w:val=""/>
+      <w:lvlJc w:val="left"/>
+      <w:pPr>
+        <w:ind w:left="2520" w:hanging="360"/>
+      </w:pPr>
+      <w:rPr>
+        <w:rFonts w:ascii="Wingdings" w:hAnsi="Wingdings" w:hint="default"/>
+      </w:rPr>
+    </w:lvl>
+    <w:lvl w:ilvl="3" w:tplc="08070001" w:tentative="1">
+      <w:start w:val="1"/>
+      <w:numFmt w:val="bullet"/>
+      <w:lvlText w:val=""/>
+      <w:lvlJc w:val="left"/>
+      <w:pPr>
+        <w:ind w:left="3240" w:hanging="360"/>
+      </w:pPr>
+      <w:rPr>
+        <w:rFonts w:ascii="Symbol" w:hAnsi="Symbol" w:hint="default"/>
+      </w:rPr>
+    </w:lvl>
+    <w:lvl w:ilvl="4" w:tplc="08070003" w:tentative="1">
+      <w:start w:val="1"/>
+      <w:numFmt w:val="bullet"/>
+      <w:lvlText w:val="o"/>
+      <w:lvlJc w:val="left"/>
+      <w:pPr>
+        <w:ind w:left="3960" w:hanging="360"/>
+      </w:pPr>
+      <w:rPr>
+        <w:rFonts w:ascii="Courier New" w:hAnsi="Courier New" w:cs="Courier New" w:hint="default"/>
+      </w:rPr>
+    </w:lvl>
+    <w:lvl w:ilvl="5" w:tplc="08070005" w:tentative="1">
+      <w:start w:val="1"/>
+      <w:numFmt w:val="bullet"/>
+      <w:lvlText w:val=""/>
+      <w:lvlJc w:val="left"/>
+      <w:pPr>
+        <w:ind w:left="4680" w:hanging="360"/>
+      </w:pPr>
+      <w:rPr>
+        <w:rFonts w:ascii="Wingdings" w:hAnsi="Wingdings" w:hint="default"/>
+      </w:rPr>
+    </w:lvl>
+    <w:lvl w:ilvl="6" w:tplc="08070001" w:tentative="1">
+      <w:start w:val="1"/>
+      <w:numFmt w:val="bullet"/>
+      <w:lvlText w:val=""/>
+      <w:lvlJc w:val="left"/>
+      <w:pPr>
+        <w:ind w:left="5400" w:hanging="360"/>
+      </w:pPr>
+      <w:rPr>
+        <w:rFonts w:ascii="Symbol" w:hAnsi="Symbol" w:hint="default"/>
+      </w:rPr>
+    </w:lvl>
+    <w:lvl w:ilvl="7" w:tplc="08070003" w:tentative="1">
+      <w:start w:val="1"/>
+      <w:numFmt w:val="bullet"/>
+      <w:lvlText w:val="o"/>
+      <w:lvlJc w:val="left"/>
+      <w:pPr>
+        <w:ind w:left="6120" w:hanging="360"/>
+      </w:pPr>
+      <w:rPr>
+        <w:rFonts w:ascii="Courier New" w:hAnsi="Courier New" w:cs="Courier New" w:hint="default"/>
+      </w:rPr>
+    </w:lvl>
+    <w:lvl w:ilvl="8" w:tplc="08070005" w:tentative="1">
+      <w:start w:val="1"/>
+      <w:numFmt w:val="bullet"/>
+      <w:lvlText w:val=""/>
+      <w:lvlJc w:val="left"/>
+      <w:pPr>
+        <w:ind w:left="6840" w:hanging="360"/>
+      </w:pPr>
+      <w:rPr>
+        <w:rFonts w:ascii="Wingdings" w:hAnsi="Wingdings" w:hint="default"/>
+      </w:rPr>
+    </w:lvl>
+  </w:abstractNum>
+  <w:abstractNum w:abstractNumId="7" w15:restartNumberingAfterBreak="0">
+    <w:nsid w:val="70FE0A51"/>
+    <w:multiLevelType w:val="multilevel"/>
+    <w:tmpl w:val="D43444C0"/>
+    <w:lvl w:ilvl="0">
+      <w:start w:val="1"/>
+      <w:numFmt w:val="decimal"/>
+      <w:lvlText w:val="%1"/>
+      <w:lvlJc w:val="left"/>
+      <w:pPr>
+        <w:ind w:left="593" w:hanging="593"/>
+      </w:pPr>
+      <w:rPr>
+        <w:rFonts w:hint="default"/>
+      </w:rPr>
+    </w:lvl>
+    <w:lvl w:ilvl="1">
+      <w:start w:val="1"/>
+      <w:numFmt w:val="decimal"/>
+      <w:lvlText w:val="%1.%2"/>
+      <w:lvlJc w:val="left"/>
+      <w:pPr>
+        <w:ind w:left="593" w:hanging="593"/>
+      </w:pPr>
+      <w:rPr>
+        <w:rFonts w:hint="default"/>
+      </w:rPr>
+    </w:lvl>
+    <w:lvl w:ilvl="2">
+      <w:start w:val="1"/>
+      <w:numFmt w:val="decimal"/>
+      <w:lvlText w:val="%1.%2.%3"/>
+      <w:lvlJc w:val="left"/>
+      <w:pPr>
+        <w:ind w:left="720" w:hanging="720"/>
+      </w:pPr>
+      <w:rPr>
+        <w:rFonts w:hint="default"/>
+      </w:rPr>
+    </w:lvl>
+    <w:lvl w:ilvl="3">
+      <w:start w:val="1"/>
+      <w:numFmt w:val="decimal"/>
+      <w:lvlText w:val="%1.%2.%3.%4"/>
+      <w:lvlJc w:val="left"/>
+      <w:pPr>
+        <w:ind w:left="1080" w:hanging="1080"/>
+      </w:pPr>
+      <w:rPr>
+        <w:rFonts w:hint="default"/>
+      </w:rPr>
+    </w:lvl>
+    <w:lvl w:ilvl="4">
+      <w:start w:val="1"/>
+      <w:numFmt w:val="decimal"/>
+      <w:lvlText w:val="%1.%2.%3.%4.%5"/>
+      <w:lvlJc w:val="left"/>
+      <w:pPr>
+        <w:ind w:left="1080" w:hanging="1080"/>
+      </w:pPr>
+      <w:rPr>
+        <w:rFonts w:hint="default"/>
+      </w:rPr>
+    </w:lvl>
+    <w:lvl w:ilvl="5">
+      <w:start w:val="1"/>
+      <w:numFmt w:val="decimal"/>
+      <w:lvlText w:val="%1.%2.%3.%4.%5.%6"/>
+      <w:lvlJc w:val="left"/>
+      <w:pPr>
+        <w:ind w:left="1440" w:hanging="1440"/>
+      </w:pPr>
+      <w:rPr>
+        <w:rFonts w:hint="default"/>
+      </w:rPr>
+    </w:lvl>
+    <w:lvl w:ilvl="6">
+      <w:start w:val="1"/>
+      <w:numFmt w:val="decimal"/>
+      <w:lvlText w:val="%1.%2.%3.%4.%5.%6.%7"/>
+      <w:lvlJc w:val="left"/>
+      <w:pPr>
+        <w:ind w:left="1440" w:hanging="1440"/>
+      </w:pPr>
+      <w:rPr>
+        <w:rFonts w:hint="default"/>
+      </w:rPr>
+    </w:lvl>
+    <w:lvl w:ilvl="7">
+      <w:start w:val="1"/>
+      <w:numFmt w:val="decimal"/>
+      <w:lvlText w:val="%1.%2.%3.%4.%5.%6.%7.%8"/>
+      <w:lvlJc w:val="left"/>
+      <w:pPr>
+        <w:ind w:left="1800" w:hanging="1800"/>
+      </w:pPr>
+      <w:rPr>
+        <w:rFonts w:hint="default"/>
+      </w:rPr>
+    </w:lvl>
+    <w:lvl w:ilvl="8">
+      <w:start w:val="1"/>
+      <w:numFmt w:val="decimal"/>
+      <w:lvlText w:val="%1.%2.%3.%4.%5.%6.%7.%8.%9"/>
+      <w:lvlJc w:val="left"/>
+      <w:pPr>
+        <w:ind w:left="1800" w:hanging="1800"/>
+      </w:pPr>
+      <w:rPr>
+        <w:rFonts w:hint="default"/>
+      </w:rPr>
+    </w:lvl>
+  </w:abstractNum>
+  <w:num w:numId="1" w16cid:durableId="2006740709">
+    <w:abstractNumId w:val="7"/>
+  </w:num>
+  <w:num w:numId="2" w16cid:durableId="891312428">
+    <w:abstractNumId w:val="2"/>
+  </w:num>
+  <w:num w:numId="3" w16cid:durableId="1615138493">
+    <w:abstractNumId w:val="1"/>
+  </w:num>
+  <w:num w:numId="4" w16cid:durableId="1828783132">
+    <w:abstractNumId w:val="3"/>
+  </w:num>
+  <w:num w:numId="5" w16cid:durableId="127362286">
+    <w:abstractNumId w:val="5"/>
+  </w:num>
+  <w:num w:numId="6" w16cid:durableId="545946974">
+    <w:abstractNumId w:val="6"/>
+  </w:num>
+  <w:num w:numId="7" w16cid:durableId="220021880">
+    <w:abstractNumId w:val="0"/>
+  </w:num>
+  <w:num w:numId="8" w16cid:durableId="130752365">
+    <w:abstractNumId w:val="4"/>
+  </w:num>
+</w:numbering>
 </file>
 
 <file path=word/styles.xml><?xml version="1.0" encoding="utf-8"?>
@@ -1888,7 +5342,6 @@
   <w:style w:type="character" w:default="1" w:styleId="Absatz-Standardschriftart">
     <w:name w:val="Default Paragraph Font"/>
     <w:uiPriority w:val="1"/>
-    <w:semiHidden/>
     <w:unhideWhenUsed/>
   </w:style>
   <w:style w:type="table" w:default="1" w:styleId="NormaleTabelle">
@@ -2355,6 +5808,25 @@
       <w:ind w:left="480"/>
     </w:pPr>
   </w:style>
+  <w:style w:type="table" w:styleId="Tabellenraster">
+    <w:name w:val="Table Grid"/>
+    <w:basedOn w:val="NormaleTabelle"/>
+    <w:uiPriority w:val="39"/>
+    <w:rsid w:val="002F3B94"/>
+    <w:pPr>
+      <w:spacing w:after="0" w:line="240" w:lineRule="auto"/>
+    </w:pPr>
+    <w:tblPr>
+      <w:tblBorders>
+        <w:top w:val="single" w:sz="4" w:space="0" w:color="auto"/>
+        <w:left w:val="single" w:sz="4" w:space="0" w:color="auto"/>
+        <w:bottom w:val="single" w:sz="4" w:space="0" w:color="auto"/>
+        <w:right w:val="single" w:sz="4" w:space="0" w:color="auto"/>
+        <w:insideH w:val="single" w:sz="4" w:space="0" w:color="auto"/>
+        <w:insideV w:val="single" w:sz="4" w:space="0" w:color="auto"/>
+      </w:tblBorders>
+    </w:tblPr>
+  </w:style>
 </w:styles>
 </file>
 
@@ -2471,11 +5943,12 @@
 
 <file path=word/glossary/fontTable.xml><?xml version="1.0" encoding="utf-8"?>
 <w:fonts xmlns:mc="http://schemas.openxmlformats.org/markup-compatibility/2006" xmlns:r="http://schemas.openxmlformats.org/officeDocument/2006/relationships" xmlns:w="http://schemas.openxmlformats.org/wordprocessingml/2006/main" xmlns:w14="http://schemas.microsoft.com/office/word/2010/wordml" xmlns:w15="http://schemas.microsoft.com/office/word/2012/wordml" xmlns:w16cex="http://schemas.microsoft.com/office/word/2018/wordml/cex" xmlns:w16cid="http://schemas.microsoft.com/office/word/2016/wordml/cid" xmlns:w16="http://schemas.microsoft.com/office/word/2018/wordml" xmlns:w16du="http://schemas.microsoft.com/office/word/2023/wordml/word16du" xmlns:w16sdtdh="http://schemas.microsoft.com/office/word/2020/wordml/sdtdatahash" xmlns:w16sdtfl="http://schemas.microsoft.com/office/word/2024/wordml/sdtformatlock" xmlns:w16se="http://schemas.microsoft.com/office/word/2015/wordml/symex" mc:Ignorable="w14 w15 w16se w16cid w16 w16cex w16sdtdh w16sdtfl w16du">
-  <w:font w:name="Aptos">
-    <w:charset w:val="00"/>
-    <w:family w:val="swiss"/>
+  <w:font w:name="Symbol">
+    <w:panose1 w:val="05050102010706020507"/>
+    <w:charset w:val="02"/>
+    <w:family w:val="roman"/>
     <w:pitch w:val="variable"/>
-    <w:sig w:usb0="20000287" w:usb1="00000003" w:usb2="00000000" w:usb3="00000000" w:csb0="0000019F" w:csb1="00000000"/>
+    <w:sig w:usb0="00000000" w:usb1="10000000" w:usb2="00000000" w:usb3="00000000" w:csb0="80000000" w:csb1="00000000"/>
   </w:font>
   <w:font w:name="Times New Roman">
     <w:panose1 w:val="02020603050405020304"/>
@@ -2483,6 +5956,26 @@
     <w:family w:val="roman"/>
     <w:pitch w:val="variable"/>
     <w:sig w:usb0="E0002EFF" w:usb1="C000785B" w:usb2="00000009" w:usb3="00000000" w:csb0="000001FF" w:csb1="00000000"/>
+  </w:font>
+  <w:font w:name="Courier New">
+    <w:panose1 w:val="02070309020205020404"/>
+    <w:charset w:val="00"/>
+    <w:family w:val="modern"/>
+    <w:pitch w:val="fixed"/>
+    <w:sig w:usb0="E0002EFF" w:usb1="C0007843" w:usb2="00000009" w:usb3="00000000" w:csb0="000001FF" w:csb1="00000000"/>
+  </w:font>
+  <w:font w:name="Wingdings">
+    <w:panose1 w:val="05000000000000000000"/>
+    <w:charset w:val="02"/>
+    <w:family w:val="auto"/>
+    <w:pitch w:val="variable"/>
+    <w:sig w:usb0="00000000" w:usb1="10000000" w:usb2="00000000" w:usb3="00000000" w:csb0="80000000" w:csb1="00000000"/>
+  </w:font>
+  <w:font w:name="Aptos">
+    <w:charset w:val="00"/>
+    <w:family w:val="swiss"/>
+    <w:pitch w:val="variable"/>
+    <w:sig w:usb0="20000287" w:usb1="00000003" w:usb2="00000000" w:usb3="00000000" w:csb0="0000019F" w:csb1="00000000"/>
   </w:font>
   <w:font w:name="Aptos Display">
     <w:charset w:val="00"/>
@@ -2510,9 +6003,13 @@
   </w:compat>
   <w:rsids>
     <w:rsidRoot w:val="00304B56"/>
+    <w:rsid w:val="00206681"/>
     <w:rsid w:val="00304B56"/>
+    <w:rsid w:val="0066449D"/>
     <w:rsid w:val="006B0100"/>
-    <w:rsid w:val="00FC16E6"/>
+    <w:rsid w:val="00A83E23"/>
+    <w:rsid w:val="00B968CC"/>
+    <w:rsid w:val="00DC14A0"/>
   </w:rsids>
   <m:mathPr>
     <m:mathFont m:val="Cambria Math"/>
@@ -2973,18 +6470,6 @@
       <w:color w:val="666666"/>
     </w:rPr>
   </w:style>
-  <w:style w:type="paragraph" w:customStyle="1" w:styleId="0A3C9C22C36D4718948034F01AE3F026">
-    <w:name w:val="0A3C9C22C36D4718948034F01AE3F026"/>
-    <w:rsid w:val="00304B56"/>
-  </w:style>
-  <w:style w:type="paragraph" w:customStyle="1" w:styleId="0DCC1DFB3F9948F79D699B2AA2A304FF">
-    <w:name w:val="0DCC1DFB3F9948F79D699B2AA2A304FF"/>
-    <w:rsid w:val="00304B56"/>
-  </w:style>
-  <w:style w:type="paragraph" w:customStyle="1" w:styleId="DB2A83EC6F5A49E893D622951593A595">
-    <w:name w:val="DB2A83EC6F5A49E893D622951593A595"/>
-    <w:rsid w:val="00304B56"/>
-  </w:style>
 </w:styles>
 </file>
 

</xml_diff>